<commit_message>
Add my file to GitHub
</commit_message>
<xml_diff>
--- a/2551528_SMARAN_DAHAL.docx
+++ b/2551528_SMARAN_DAHAL.docx
@@ -121,7 +121,7 @@
           <w:sz w:val="36"/>
           <w:szCs w:val="36"/>
         </w:rPr>
-        <w:t xml:space="preserve">Module: </w:t>
+        <w:t>Course Name</w:t>
       </w:r>
       <w:r>
         <w:rPr>
@@ -129,7 +129,31 @@
           <w:sz w:val="36"/>
           <w:szCs w:val="36"/>
         </w:rPr>
+        <w:t xml:space="preserve">: </w:t>
+      </w:r>
+      <w:r>
+        <w:rPr>
+          <w:rFonts w:ascii="Times New Roman" w:eastAsia="Times New Roman" w:hAnsi="Times New Roman" w:cs="Times New Roman"/>
+          <w:sz w:val="36"/>
+          <w:szCs w:val="36"/>
+        </w:rPr>
+        <w:t>Concept and Technologies of AI (</w:t>
+      </w:r>
+      <w:r>
+        <w:rPr>
+          <w:rFonts w:ascii="Times New Roman" w:eastAsia="Times New Roman" w:hAnsi="Times New Roman" w:cs="Times New Roman"/>
+          <w:sz w:val="36"/>
+          <w:szCs w:val="36"/>
+        </w:rPr>
         <w:t>5CS037</w:t>
+      </w:r>
+      <w:r>
+        <w:rPr>
+          <w:rFonts w:ascii="Times New Roman" w:eastAsia="Times New Roman" w:hAnsi="Times New Roman" w:cs="Times New Roman"/>
+          <w:sz w:val="36"/>
+          <w:szCs w:val="36"/>
+        </w:rPr>
+        <w:t>)</w:t>
       </w:r>
       <w:r>
         <w:rPr>
@@ -499,212 +523,183 @@
     <w:p>
       <w:pPr>
         <w:spacing w:after="0" w:line="240" w:lineRule="auto"/>
-        <w:rPr>
-          <w:rFonts w:ascii="Times New Roman" w:eastAsia="Times New Roman" w:hAnsi="Times New Roman" w:cs="Times New Roman"/>
-          <w:sz w:val="40"/>
-          <w:szCs w:val="40"/>
-        </w:rPr>
-      </w:pPr>
-      <w:r>
+        <w:ind w:left="720"/>
+        <w:rPr>
+          <w:rFonts w:ascii="Times New Roman" w:eastAsia="Times New Roman" w:hAnsi="Times New Roman" w:cs="Times New Roman"/>
+          <w:sz w:val="24"/>
+          <w:szCs w:val="24"/>
+        </w:rPr>
+      </w:pPr>
+      <w:proofErr w:type="gramStart"/>
+      <w:r>
+        <w:rPr>
+          <w:rFonts w:ascii="Times New Roman" w:eastAsia="Times New Roman" w:hAnsi="Symbol" w:cs="Times New Roman"/>
+          <w:sz w:val="24"/>
+          <w:szCs w:val="24"/>
+        </w:rPr>
+        <w:t></w:t>
+      </w:r>
+      <w:r>
+        <w:rPr>
+          <w:rFonts w:ascii="Times New Roman" w:eastAsia="Times New Roman" w:hAnsi="Times New Roman" w:cs="Times New Roman"/>
+          <w:sz w:val="24"/>
+          <w:szCs w:val="24"/>
+        </w:rPr>
+        <w:t xml:space="preserve">  Introduction</w:t>
+      </w:r>
+      <w:proofErr w:type="gramEnd"/>
+      <w:r>
+        <w:rPr>
+          <w:rFonts w:ascii="Times New Roman" w:eastAsia="Times New Roman" w:hAnsi="Times New Roman" w:cs="Times New Roman"/>
+          <w:sz w:val="24"/>
+          <w:szCs w:val="24"/>
+        </w:rPr>
+        <w:t xml:space="preserve"> – Overview of HDI and Study Objectives</w:t>
+      </w:r>
+    </w:p>
+    <w:p>
+      <w:pPr>
+        <w:numPr>
+          <w:ilvl w:val="0"/>
+          <w:numId w:val="19"/>
+        </w:numPr>
+        <w:spacing w:before="100" w:beforeAutospacing="1" w:after="100" w:afterAutospacing="1" w:line="240" w:lineRule="auto"/>
+        <w:rPr>
+          <w:rFonts w:ascii="Times New Roman" w:eastAsia="Times New Roman" w:hAnsi="Times New Roman" w:cs="Times New Roman"/>
+          <w:sz w:val="24"/>
+          <w:szCs w:val="24"/>
+        </w:rPr>
+      </w:pPr>
+      <w:r>
+        <w:rPr>
+          <w:rFonts w:ascii="Times New Roman" w:eastAsia="Times New Roman" w:hAnsi="Times New Roman" w:cs="Times New Roman"/>
+          <w:sz w:val="24"/>
+          <w:szCs w:val="24"/>
+        </w:rPr>
+        <w:t>Analysis 1A – HDI in 2022 (Single Year)</w:t>
+      </w:r>
+    </w:p>
+    <w:p>
+      <w:pPr>
+        <w:numPr>
+          <w:ilvl w:val="0"/>
+          <w:numId w:val="19"/>
+        </w:numPr>
+        <w:spacing w:before="100" w:beforeAutospacing="1" w:after="100" w:afterAutospacing="1" w:line="240" w:lineRule="auto"/>
+        <w:rPr>
+          <w:rFonts w:ascii="Times New Roman" w:eastAsia="Times New Roman" w:hAnsi="Times New Roman" w:cs="Times New Roman"/>
+          <w:sz w:val="24"/>
+          <w:szCs w:val="24"/>
+        </w:rPr>
+      </w:pPr>
+      <w:r>
+        <w:rPr>
+          <w:rFonts w:ascii="Times New Roman" w:eastAsia="Times New Roman" w:hAnsi="Times New Roman" w:cs="Times New Roman"/>
+          <w:sz w:val="24"/>
+          <w:szCs w:val="24"/>
+        </w:rPr>
+        <w:t>Analysis 1B – HDI Trends, 2020–2022</w:t>
+      </w:r>
+    </w:p>
+    <w:p>
+      <w:pPr>
+        <w:numPr>
+          <w:ilvl w:val="0"/>
+          <w:numId w:val="19"/>
+        </w:numPr>
+        <w:spacing w:before="100" w:beforeAutospacing="1" w:after="100" w:afterAutospacing="1" w:line="240" w:lineRule="auto"/>
+        <w:rPr>
+          <w:rFonts w:ascii="Times New Roman" w:eastAsia="Times New Roman" w:hAnsi="Times New Roman" w:cs="Times New Roman"/>
+          <w:sz w:val="24"/>
+          <w:szCs w:val="24"/>
+        </w:rPr>
+      </w:pPr>
+      <w:r>
+        <w:rPr>
+          <w:rFonts w:ascii="Times New Roman" w:eastAsia="Times New Roman" w:hAnsi="Times New Roman" w:cs="Times New Roman"/>
+          <w:sz w:val="24"/>
+          <w:szCs w:val="24"/>
+        </w:rPr>
+        <w:t>Analysis 2 – South Asia HDI: Composite Scores and Correlations</w:t>
+      </w:r>
+    </w:p>
+    <w:p>
+      <w:pPr>
+        <w:numPr>
+          <w:ilvl w:val="0"/>
+          <w:numId w:val="19"/>
+        </w:numPr>
+        <w:spacing w:before="100" w:beforeAutospacing="1" w:after="100" w:afterAutospacing="1" w:line="240" w:lineRule="auto"/>
+        <w:rPr>
+          <w:rFonts w:ascii="Times New Roman" w:eastAsia="Times New Roman" w:hAnsi="Times New Roman" w:cs="Times New Roman"/>
+          <w:sz w:val="24"/>
+          <w:szCs w:val="24"/>
+        </w:rPr>
+      </w:pPr>
+      <w:r>
+        <w:rPr>
+          <w:rFonts w:ascii="Times New Roman" w:eastAsia="Times New Roman" w:hAnsi="Times New Roman" w:cs="Times New Roman"/>
+          <w:sz w:val="24"/>
+          <w:szCs w:val="24"/>
+        </w:rPr>
+        <w:t>Analysis 3 – Comparative Study: South Asia vs Middle East</w:t>
+      </w:r>
+    </w:p>
+    <w:p>
+      <w:pPr>
+        <w:numPr>
+          <w:ilvl w:val="0"/>
+          <w:numId w:val="19"/>
+        </w:numPr>
+        <w:spacing w:before="100" w:beforeAutospacing="1" w:after="100" w:afterAutospacing="1" w:line="240" w:lineRule="auto"/>
+        <w:rPr>
+          <w:rFonts w:ascii="Times New Roman" w:eastAsia="Times New Roman" w:hAnsi="Times New Roman" w:cs="Times New Roman"/>
+          <w:sz w:val="24"/>
+          <w:szCs w:val="24"/>
+        </w:rPr>
+      </w:pPr>
+      <w:r>
+        <w:rPr>
+          <w:rFonts w:ascii="Times New Roman" w:eastAsia="Times New Roman" w:hAnsi="Times New Roman" w:cs="Times New Roman"/>
+          <w:sz w:val="24"/>
+          <w:szCs w:val="24"/>
+        </w:rPr>
+        <w:t>Summary and Implications</w:t>
+      </w:r>
+    </w:p>
+    <w:p>
+      <w:pPr>
+        <w:numPr>
+          <w:ilvl w:val="0"/>
+          <w:numId w:val="19"/>
+        </w:numPr>
+        <w:spacing w:before="100" w:beforeAutospacing="1" w:after="100" w:afterAutospacing="1" w:line="240" w:lineRule="auto"/>
+        <w:rPr>
+          <w:rFonts w:ascii="Times New Roman" w:eastAsia="Times New Roman" w:hAnsi="Times New Roman" w:cs="Times New Roman"/>
+          <w:sz w:val="24"/>
+          <w:szCs w:val="24"/>
+        </w:rPr>
+      </w:pPr>
+      <w:r>
+        <w:rPr>
+          <w:rFonts w:ascii="Times New Roman" w:eastAsia="Times New Roman" w:hAnsi="Times New Roman" w:cs="Times New Roman"/>
+          <w:sz w:val="24"/>
+          <w:szCs w:val="24"/>
+        </w:rPr>
+        <w:t>References – Methodology and Dataset</w:t>
+      </w:r>
+    </w:p>
+    <w:p>
+      <w:pPr>
+        <w:spacing w:after="0" w:line="240" w:lineRule="auto"/>
         <w:rPr>
           <w:rFonts w:ascii="Times New Roman" w:eastAsia="Times New Roman" w:hAnsi="Times New Roman" w:cs="Times New Roman"/>
           <w:b/>
           <w:bCs/>
-          <w:sz w:val="40"/>
-          <w:szCs w:val="40"/>
-        </w:rPr>
-        <w:t xml:space="preserve">- </w:t>
-      </w:r>
-      <w:r>
-        <w:rPr>
-          <w:rFonts w:ascii="Times New Roman" w:eastAsia="Times New Roman" w:hAnsi="Times New Roman" w:cs="Times New Roman"/>
-          <w:sz w:val="40"/>
-          <w:szCs w:val="40"/>
-        </w:rPr>
-        <w:t>Introduction</w:t>
-      </w:r>
-    </w:p>
-    <w:p>
-      <w:pPr>
-        <w:spacing w:after="0" w:line="240" w:lineRule="auto"/>
-        <w:rPr>
-          <w:rFonts w:ascii="Times New Roman" w:eastAsia="Times New Roman" w:hAnsi="Times New Roman" w:cs="Times New Roman"/>
-          <w:sz w:val="40"/>
-          <w:szCs w:val="40"/>
-        </w:rPr>
-      </w:pPr>
-      <w:r>
-        <w:rPr>
-          <w:rFonts w:ascii="Times New Roman" w:eastAsia="Times New Roman" w:hAnsi="Times New Roman" w:cs="Times New Roman"/>
-          <w:sz w:val="40"/>
-          <w:szCs w:val="40"/>
-        </w:rPr>
-        <w:t xml:space="preserve">- </w:t>
-      </w:r>
-      <w:r>
-        <w:rPr>
-          <w:rFonts w:ascii="Times New Roman" w:eastAsia="Times New Roman" w:hAnsi="Times New Roman" w:cs="Times New Roman"/>
-          <w:sz w:val="40"/>
-          <w:szCs w:val="40"/>
-        </w:rPr>
-        <w:t>Question</w:t>
-      </w:r>
-      <w:r>
-        <w:rPr>
-          <w:rFonts w:ascii="Times New Roman" w:eastAsia="Times New Roman" w:hAnsi="Times New Roman" w:cs="Times New Roman"/>
-          <w:sz w:val="40"/>
-          <w:szCs w:val="40"/>
-        </w:rPr>
-        <w:t xml:space="preserve"> 1A – Single Year HDI Exploration</w:t>
-      </w:r>
-    </w:p>
-    <w:p>
-      <w:pPr>
-        <w:spacing w:after="0" w:line="240" w:lineRule="auto"/>
-        <w:rPr>
-          <w:rFonts w:ascii="Times New Roman" w:eastAsia="Times New Roman" w:hAnsi="Times New Roman" w:cs="Times New Roman"/>
-          <w:sz w:val="40"/>
-          <w:szCs w:val="40"/>
-        </w:rPr>
-      </w:pPr>
-      <w:r>
-        <w:rPr>
-          <w:rFonts w:ascii="Times New Roman" w:eastAsia="Times New Roman" w:hAnsi="Times New Roman" w:cs="Times New Roman"/>
-          <w:sz w:val="40"/>
-          <w:szCs w:val="40"/>
-        </w:rPr>
-        <w:t xml:space="preserve">- </w:t>
-      </w:r>
-      <w:r>
-        <w:rPr>
-          <w:rFonts w:ascii="Times New Roman" w:eastAsia="Times New Roman" w:hAnsi="Times New Roman" w:cs="Times New Roman"/>
-          <w:sz w:val="40"/>
-          <w:szCs w:val="40"/>
-        </w:rPr>
-        <w:t>Question</w:t>
-      </w:r>
-      <w:r>
-        <w:rPr>
-          <w:rFonts w:ascii="Times New Roman" w:eastAsia="Times New Roman" w:hAnsi="Times New Roman" w:cs="Times New Roman"/>
-          <w:sz w:val="40"/>
-          <w:szCs w:val="40"/>
-        </w:rPr>
-        <w:t xml:space="preserve"> 1B – HDI Trend Analysis (2020–2022)</w:t>
-      </w:r>
-    </w:p>
-    <w:p>
-      <w:pPr>
-        <w:spacing w:after="0" w:line="240" w:lineRule="auto"/>
-        <w:rPr>
-          <w:rFonts w:ascii="Times New Roman" w:eastAsia="Times New Roman" w:hAnsi="Times New Roman" w:cs="Times New Roman"/>
-          <w:sz w:val="40"/>
-          <w:szCs w:val="40"/>
-        </w:rPr>
-      </w:pPr>
-      <w:r>
-        <w:rPr>
-          <w:rFonts w:ascii="Times New Roman" w:eastAsia="Times New Roman" w:hAnsi="Times New Roman" w:cs="Times New Roman"/>
-          <w:sz w:val="40"/>
-          <w:szCs w:val="40"/>
-        </w:rPr>
-        <w:t xml:space="preserve">- </w:t>
-      </w:r>
-      <w:r>
-        <w:rPr>
-          <w:rFonts w:ascii="Times New Roman" w:eastAsia="Times New Roman" w:hAnsi="Times New Roman" w:cs="Times New Roman"/>
-          <w:sz w:val="40"/>
-          <w:szCs w:val="40"/>
-        </w:rPr>
-        <w:t>Question</w:t>
-      </w:r>
-      <w:r>
-        <w:rPr>
-          <w:rFonts w:ascii="Times New Roman" w:eastAsia="Times New Roman" w:hAnsi="Times New Roman" w:cs="Times New Roman"/>
-          <w:sz w:val="40"/>
-          <w:szCs w:val="40"/>
-        </w:rPr>
-        <w:t xml:space="preserve"> 2 – Advanced HDI Exploration (South Asia)</w:t>
-      </w:r>
-    </w:p>
-    <w:p>
-      <w:pPr>
-        <w:spacing w:after="0" w:line="240" w:lineRule="auto"/>
-        <w:rPr>
-          <w:rFonts w:ascii="Times New Roman" w:eastAsia="Times New Roman" w:hAnsi="Times New Roman" w:cs="Times New Roman"/>
-          <w:sz w:val="40"/>
-          <w:szCs w:val="40"/>
-        </w:rPr>
-      </w:pPr>
-      <w:r>
-        <w:rPr>
-          <w:rFonts w:ascii="Times New Roman" w:eastAsia="Times New Roman" w:hAnsi="Times New Roman" w:cs="Times New Roman"/>
-          <w:sz w:val="40"/>
-          <w:szCs w:val="40"/>
-        </w:rPr>
-        <w:t xml:space="preserve">- </w:t>
-      </w:r>
-      <w:r>
-        <w:rPr>
-          <w:rFonts w:ascii="Times New Roman" w:eastAsia="Times New Roman" w:hAnsi="Times New Roman" w:cs="Times New Roman"/>
-          <w:sz w:val="40"/>
-          <w:szCs w:val="40"/>
-        </w:rPr>
-        <w:t>Question</w:t>
-      </w:r>
-      <w:r>
-        <w:rPr>
-          <w:rFonts w:ascii="Times New Roman" w:eastAsia="Times New Roman" w:hAnsi="Times New Roman" w:cs="Times New Roman"/>
-          <w:sz w:val="40"/>
-          <w:szCs w:val="40"/>
-        </w:rPr>
-        <w:t xml:space="preserve"> 3 – Comparative Regional Analysis (South Asia vs Middle East)</w:t>
-      </w:r>
-    </w:p>
-    <w:p>
-      <w:pPr>
-        <w:spacing w:after="0" w:line="240" w:lineRule="auto"/>
-        <w:rPr>
-          <w:rFonts w:ascii="Times New Roman" w:eastAsia="Times New Roman" w:hAnsi="Times New Roman" w:cs="Times New Roman"/>
-          <w:sz w:val="40"/>
-          <w:szCs w:val="40"/>
-        </w:rPr>
-      </w:pPr>
-      <w:r>
-        <w:rPr>
-          <w:rFonts w:ascii="Times New Roman" w:eastAsia="Times New Roman" w:hAnsi="Times New Roman" w:cs="Times New Roman"/>
-          <w:sz w:val="40"/>
-          <w:szCs w:val="40"/>
-        </w:rPr>
-        <w:t>- Conclusion</w:t>
-      </w:r>
-    </w:p>
-    <w:p>
-      <w:pPr>
-        <w:spacing w:after="0" w:line="240" w:lineRule="auto"/>
-        <w:rPr>
-          <w:rFonts w:ascii="Times New Roman" w:eastAsia="Times New Roman" w:hAnsi="Times New Roman" w:cs="Times New Roman"/>
-          <w:sz w:val="40"/>
-          <w:szCs w:val="40"/>
-        </w:rPr>
-      </w:pPr>
-      <w:r>
-        <w:rPr>
-          <w:rFonts w:ascii="Times New Roman" w:eastAsia="Times New Roman" w:hAnsi="Times New Roman" w:cs="Times New Roman"/>
-          <w:sz w:val="40"/>
-          <w:szCs w:val="40"/>
-        </w:rPr>
-        <w:t xml:space="preserve">- </w:t>
-      </w:r>
-      <w:proofErr w:type="spellStart"/>
-      <w:r>
-        <w:rPr>
-          <w:rFonts w:ascii="Times New Roman" w:eastAsia="Times New Roman" w:hAnsi="Times New Roman" w:cs="Times New Roman"/>
-          <w:sz w:val="40"/>
-          <w:szCs w:val="40"/>
-        </w:rPr>
-        <w:t>Refrences</w:t>
-      </w:r>
-      <w:proofErr w:type="spellEnd"/>
+          <w:sz w:val="24"/>
+          <w:szCs w:val="24"/>
+        </w:rPr>
+      </w:pPr>
     </w:p>
     <w:p>
       <w:pPr>
@@ -864,15 +859,24 @@
     </w:p>
     <w:p>
       <w:pPr>
+        <w:tabs>
+          <w:tab w:val="left" w:pos="2592"/>
+        </w:tabs>
         <w:spacing w:after="0" w:line="240" w:lineRule="auto"/>
         <w:rPr>
           <w:rFonts w:ascii="Times New Roman" w:eastAsia="Times New Roman" w:hAnsi="Times New Roman" w:cs="Times New Roman"/>
-          <w:b/>
-          <w:bCs/>
-          <w:sz w:val="24"/>
-          <w:szCs w:val="24"/>
-        </w:rPr>
-      </w:pPr>
+          <w:sz w:val="24"/>
+          <w:szCs w:val="24"/>
+        </w:rPr>
+      </w:pPr>
+      <w:r>
+        <w:rPr>
+          <w:rFonts w:ascii="Times New Roman" w:eastAsia="Times New Roman" w:hAnsi="Times New Roman" w:cs="Times New Roman"/>
+          <w:sz w:val="24"/>
+          <w:szCs w:val="24"/>
+        </w:rPr>
+        <w:tab/>
+      </w:r>
     </w:p>
     <w:p>
       <w:pPr>
@@ -886,14 +890,32 @@
           <w:szCs w:val="24"/>
         </w:rPr>
       </w:pPr>
-      <w:r>
-        <w:rPr>
-          <w:rFonts w:ascii="Times New Roman" w:eastAsia="Times New Roman" w:hAnsi="Times New Roman" w:cs="Times New Roman"/>
-          <w:sz w:val="24"/>
-          <w:szCs w:val="24"/>
-        </w:rPr>
-        <w:tab/>
-      </w:r>
+    </w:p>
+    <w:p>
+      <w:pPr>
+        <w:tabs>
+          <w:tab w:val="left" w:pos="2592"/>
+        </w:tabs>
+        <w:spacing w:after="0" w:line="240" w:lineRule="auto"/>
+        <w:rPr>
+          <w:rFonts w:ascii="Times New Roman" w:eastAsia="Times New Roman" w:hAnsi="Times New Roman" w:cs="Times New Roman"/>
+          <w:sz w:val="24"/>
+          <w:szCs w:val="24"/>
+        </w:rPr>
+      </w:pPr>
+    </w:p>
+    <w:p>
+      <w:pPr>
+        <w:tabs>
+          <w:tab w:val="left" w:pos="2592"/>
+        </w:tabs>
+        <w:spacing w:after="0" w:line="240" w:lineRule="auto"/>
+        <w:rPr>
+          <w:rFonts w:ascii="Times New Roman" w:eastAsia="Times New Roman" w:hAnsi="Times New Roman" w:cs="Times New Roman"/>
+          <w:sz w:val="24"/>
+          <w:szCs w:val="24"/>
+        </w:rPr>
+      </w:pPr>
     </w:p>
     <w:p>
       <w:pPr>
@@ -1125,24 +1147,284 @@
     </w:p>
     <w:p>
       <w:pPr>
-        <w:pStyle w:val="NormalWeb"/>
+        <w:spacing w:before="100" w:beforeAutospacing="1" w:after="100" w:afterAutospacing="1" w:line="240" w:lineRule="auto"/>
+        <w:rPr>
+          <w:rFonts w:ascii="Times New Roman" w:eastAsia="Times New Roman" w:hAnsi="Times New Roman" w:cs="Times New Roman"/>
+          <w:sz w:val="24"/>
+          <w:szCs w:val="24"/>
+        </w:rPr>
       </w:pPr>
       <w:bookmarkStart w:id="1" w:name="_Toc218896807"/>
       <w:r>
-        <w:t xml:space="preserve">The Human Development Index (HDI) is a composite measure that integrates indicators of health, education, and income to capture the multidimensional nature of human progress. This report explores HDI patterns using </w:t>
-      </w:r>
-      <w:r>
-        <w:rPr>
-          <w:rStyle w:val="Emphasis"/>
+        <w:rPr>
+          <w:rFonts w:ascii="Times New Roman" w:eastAsia="Times New Roman" w:hAnsi="Times New Roman" w:cs="Times New Roman"/>
+          <w:sz w:val="24"/>
+          <w:szCs w:val="24"/>
+        </w:rPr>
+        <w:br/>
+        <w:t>Human Development Index (HDI) is a composite measure that evaluates human progress by combining indicators of health, education, and income. It provides a multidimensional perspective on development, moving beyond economic growth alone to capture overall well</w:t>
+      </w:r>
+      <w:r>
+        <w:rPr>
+          <w:rFonts w:ascii="Times New Roman" w:eastAsia="Times New Roman" w:hAnsi="Times New Roman" w:cs="Times New Roman"/>
+          <w:sz w:val="24"/>
+          <w:szCs w:val="24"/>
+        </w:rPr>
+        <w:noBreakHyphen/>
+        <w:t>being.</w:t>
+      </w:r>
+    </w:p>
+    <w:p>
+      <w:pPr>
+        <w:spacing w:before="100" w:beforeAutospacing="1" w:after="100" w:afterAutospacing="1" w:line="240" w:lineRule="auto"/>
+        <w:rPr>
+          <w:rFonts w:ascii="Times New Roman" w:eastAsia="Times New Roman" w:hAnsi="Times New Roman" w:cs="Times New Roman"/>
+          <w:sz w:val="24"/>
+          <w:szCs w:val="24"/>
+        </w:rPr>
+      </w:pPr>
+      <w:r>
+        <w:rPr>
+          <w:rFonts w:ascii="Times New Roman" w:eastAsia="Times New Roman" w:hAnsi="Times New Roman" w:cs="Times New Roman"/>
+          <w:b/>
+          <w:bCs/>
+          <w:sz w:val="24"/>
+          <w:szCs w:val="24"/>
+        </w:rPr>
+        <w:t>Objectives of the Analysis:</w:t>
+      </w:r>
+      <w:r>
+        <w:rPr>
+          <w:rFonts w:ascii="Times New Roman" w:eastAsia="Times New Roman" w:hAnsi="Times New Roman" w:cs="Times New Roman"/>
+          <w:sz w:val="24"/>
+          <w:szCs w:val="24"/>
+        </w:rPr>
+        <w:br/>
+        <w:t>This report aims to examine HDI patterns through statistical interpretation and exploratory data analysis. The objectives are to:</w:t>
+      </w:r>
+    </w:p>
+    <w:p>
+      <w:pPr>
+        <w:numPr>
+          <w:ilvl w:val="0"/>
+          <w:numId w:val="18"/>
+        </w:numPr>
+        <w:spacing w:before="100" w:beforeAutospacing="1" w:after="100" w:afterAutospacing="1" w:line="240" w:lineRule="auto"/>
+        <w:rPr>
+          <w:rFonts w:ascii="Times New Roman" w:eastAsia="Times New Roman" w:hAnsi="Times New Roman" w:cs="Times New Roman"/>
+          <w:sz w:val="24"/>
+          <w:szCs w:val="24"/>
+        </w:rPr>
+      </w:pPr>
+      <w:r>
+        <w:rPr>
+          <w:rFonts w:ascii="Times New Roman" w:eastAsia="Times New Roman" w:hAnsi="Times New Roman" w:cs="Times New Roman"/>
+          <w:sz w:val="24"/>
+          <w:szCs w:val="24"/>
+        </w:rPr>
+        <w:t>Assess HDI outcomes for a single year (2022).</w:t>
+      </w:r>
+    </w:p>
+    <w:p>
+      <w:pPr>
+        <w:numPr>
+          <w:ilvl w:val="0"/>
+          <w:numId w:val="18"/>
+        </w:numPr>
+        <w:spacing w:before="100" w:beforeAutospacing="1" w:after="100" w:afterAutospacing="1" w:line="240" w:lineRule="auto"/>
+        <w:rPr>
+          <w:rFonts w:ascii="Times New Roman" w:eastAsia="Times New Roman" w:hAnsi="Times New Roman" w:cs="Times New Roman"/>
+          <w:sz w:val="24"/>
+          <w:szCs w:val="24"/>
+        </w:rPr>
+      </w:pPr>
+      <w:r>
+        <w:rPr>
+          <w:rFonts w:ascii="Times New Roman" w:eastAsia="Times New Roman" w:hAnsi="Times New Roman" w:cs="Times New Roman"/>
+          <w:sz w:val="24"/>
+          <w:szCs w:val="24"/>
+        </w:rPr>
+        <w:t>Explore short</w:t>
+      </w:r>
+      <w:r>
+        <w:rPr>
+          <w:rFonts w:ascii="Times New Roman" w:eastAsia="Times New Roman" w:hAnsi="Times New Roman" w:cs="Times New Roman"/>
+          <w:sz w:val="24"/>
+          <w:szCs w:val="24"/>
+        </w:rPr>
+        <w:noBreakHyphen/>
+        <w:t xml:space="preserve">term HDI trends </w:t>
+      </w:r>
+      <w:r>
+        <w:rPr>
+          <w:rFonts w:ascii="Times New Roman" w:eastAsia="Times New Roman" w:hAnsi="Times New Roman" w:cs="Times New Roman"/>
+          <w:sz w:val="24"/>
+          <w:szCs w:val="24"/>
+        </w:rPr>
+        <w:t>i.e.,</w:t>
+      </w:r>
+      <w:r>
+        <w:rPr>
+          <w:rFonts w:ascii="Times New Roman" w:eastAsia="Times New Roman" w:hAnsi="Times New Roman" w:cs="Times New Roman"/>
+          <w:sz w:val="24"/>
+          <w:szCs w:val="24"/>
+        </w:rPr>
+        <w:t xml:space="preserve"> 2020</w:t>
+      </w:r>
+      <w:r>
+        <w:rPr>
+          <w:rFonts w:ascii="Times New Roman" w:eastAsia="Times New Roman" w:hAnsi="Times New Roman" w:cs="Times New Roman"/>
+          <w:sz w:val="24"/>
+          <w:szCs w:val="24"/>
+        </w:rPr>
+        <w:t>-</w:t>
+      </w:r>
+      <w:r>
+        <w:rPr>
+          <w:rFonts w:ascii="Times New Roman" w:eastAsia="Times New Roman" w:hAnsi="Times New Roman" w:cs="Times New Roman"/>
+          <w:sz w:val="24"/>
+          <w:szCs w:val="24"/>
+        </w:rPr>
+        <w:t>2022.</w:t>
+      </w:r>
+    </w:p>
+    <w:p>
+      <w:pPr>
+        <w:numPr>
+          <w:ilvl w:val="0"/>
+          <w:numId w:val="18"/>
+        </w:numPr>
+        <w:spacing w:before="100" w:beforeAutospacing="1" w:after="100" w:afterAutospacing="1" w:line="240" w:lineRule="auto"/>
+        <w:rPr>
+          <w:rFonts w:ascii="Times New Roman" w:eastAsia="Times New Roman" w:hAnsi="Times New Roman" w:cs="Times New Roman"/>
+          <w:sz w:val="24"/>
+          <w:szCs w:val="24"/>
+        </w:rPr>
+      </w:pPr>
+      <w:r>
+        <w:rPr>
+          <w:rFonts w:ascii="Times New Roman" w:eastAsia="Times New Roman" w:hAnsi="Times New Roman" w:cs="Times New Roman"/>
+          <w:sz w:val="24"/>
+          <w:szCs w:val="24"/>
+        </w:rPr>
+        <w:t>Conduct advanced analysis of South Asian countries.</w:t>
+      </w:r>
+    </w:p>
+    <w:p>
+      <w:pPr>
+        <w:numPr>
+          <w:ilvl w:val="0"/>
+          <w:numId w:val="18"/>
+        </w:numPr>
+        <w:spacing w:before="100" w:beforeAutospacing="1" w:after="100" w:afterAutospacing="1" w:line="240" w:lineRule="auto"/>
+        <w:rPr>
+          <w:rFonts w:ascii="Times New Roman" w:eastAsia="Times New Roman" w:hAnsi="Times New Roman" w:cs="Times New Roman"/>
+          <w:sz w:val="24"/>
+          <w:szCs w:val="24"/>
+        </w:rPr>
+      </w:pPr>
+      <w:r>
+        <w:rPr>
+          <w:rFonts w:ascii="Times New Roman" w:eastAsia="Times New Roman" w:hAnsi="Times New Roman" w:cs="Times New Roman"/>
+          <w:sz w:val="24"/>
+          <w:szCs w:val="24"/>
+        </w:rPr>
+        <w:t>Compare HDI performance South</w:t>
+      </w:r>
+      <w:r>
+        <w:rPr>
+          <w:rFonts w:ascii="Times New Roman" w:eastAsia="Times New Roman" w:hAnsi="Times New Roman" w:cs="Times New Roman"/>
+          <w:sz w:val="24"/>
+          <w:szCs w:val="24"/>
+        </w:rPr>
+        <w:t>-</w:t>
+      </w:r>
+      <w:r>
+        <w:rPr>
+          <w:rFonts w:ascii="Times New Roman" w:eastAsia="Times New Roman" w:hAnsi="Times New Roman" w:cs="Times New Roman"/>
+          <w:sz w:val="24"/>
+          <w:szCs w:val="24"/>
+        </w:rPr>
+        <w:t>Asia</w:t>
+      </w:r>
+      <w:r>
+        <w:rPr>
+          <w:rFonts w:ascii="Times New Roman" w:eastAsia="Times New Roman" w:hAnsi="Times New Roman" w:cs="Times New Roman"/>
+          <w:sz w:val="24"/>
+          <w:szCs w:val="24"/>
+        </w:rPr>
+        <w:t xml:space="preserve"> vs </w:t>
+      </w:r>
+      <w:r>
+        <w:rPr>
+          <w:rFonts w:ascii="Times New Roman" w:eastAsia="Times New Roman" w:hAnsi="Times New Roman" w:cs="Times New Roman"/>
+          <w:sz w:val="24"/>
+          <w:szCs w:val="24"/>
+        </w:rPr>
+        <w:t>Middle</w:t>
+      </w:r>
+      <w:r>
+        <w:rPr>
+          <w:rFonts w:ascii="Times New Roman" w:eastAsia="Times New Roman" w:hAnsi="Times New Roman" w:cs="Times New Roman"/>
+          <w:sz w:val="24"/>
+          <w:szCs w:val="24"/>
+        </w:rPr>
+        <w:t>-</w:t>
+      </w:r>
+      <w:r>
+        <w:rPr>
+          <w:rFonts w:ascii="Times New Roman" w:eastAsia="Times New Roman" w:hAnsi="Times New Roman" w:cs="Times New Roman"/>
+          <w:sz w:val="24"/>
+          <w:szCs w:val="24"/>
+        </w:rPr>
+        <w:t>East.</w:t>
+      </w:r>
+    </w:p>
+    <w:p>
+      <w:pPr>
+        <w:spacing w:before="100" w:beforeAutospacing="1" w:after="100" w:afterAutospacing="1" w:line="240" w:lineRule="auto"/>
+        <w:rPr>
+          <w:rFonts w:ascii="Times New Roman" w:eastAsia="Times New Roman" w:hAnsi="Times New Roman" w:cs="Times New Roman"/>
+          <w:sz w:val="24"/>
+          <w:szCs w:val="24"/>
+        </w:rPr>
+      </w:pPr>
+      <w:r>
+        <w:rPr>
+          <w:rFonts w:ascii="Times New Roman" w:eastAsia="Times New Roman" w:hAnsi="Times New Roman" w:cs="Times New Roman"/>
+          <w:b/>
+          <w:bCs/>
+          <w:sz w:val="24"/>
+          <w:szCs w:val="24"/>
+        </w:rPr>
+        <w:t>Scope of the Report:</w:t>
+      </w:r>
+      <w:r>
+        <w:rPr>
+          <w:rFonts w:ascii="Times New Roman" w:eastAsia="Times New Roman" w:hAnsi="Times New Roman" w:cs="Times New Roman"/>
+          <w:sz w:val="24"/>
+          <w:szCs w:val="24"/>
+        </w:rPr>
+        <w:br/>
+        <w:t xml:space="preserve">The analysis is based on the </w:t>
+      </w:r>
+      <w:r>
+        <w:rPr>
+          <w:rFonts w:ascii="Times New Roman" w:eastAsia="Times New Roman" w:hAnsi="Times New Roman" w:cs="Times New Roman"/>
+          <w:i/>
+          <w:iCs/>
+          <w:sz w:val="24"/>
+          <w:szCs w:val="24"/>
         </w:rPr>
         <w:t>HumanDevelopmentIndex_Dataset.csv</w:t>
       </w:r>
       <w:r>
-        <w:t>, focusing on a single year (2022), short</w:t>
-      </w:r>
-      <w:r>
-        <w:noBreakHyphen/>
-        <w:t>term changes (2020–2022), deeper analysis of South Asia, and a comparative study between South Asia and the Middle East. The aim is to highlight disparities, extremes, and relationships that reveal the drivers of human development.</w:t>
+        <w:rPr>
+          <w:rFonts w:ascii="Times New Roman" w:eastAsia="Times New Roman" w:hAnsi="Times New Roman" w:cs="Times New Roman"/>
+          <w:sz w:val="24"/>
+          <w:szCs w:val="24"/>
+        </w:rPr>
+        <w:t xml:space="preserve"> and focuses on descriptive statistics, visualizations, and comparative insights. It highlights disparities, identifies outliers, and evaluates the role of health, education, and income in shaping HDI. Limitations include missing regional labels and restricted variables, but the study provides meaningful insights into global and regional development trends.</w:t>
       </w:r>
     </w:p>
     <w:p>
@@ -1165,7 +1447,30 @@
           <w:sz w:val="36"/>
           <w:szCs w:val="36"/>
         </w:rPr>
-        <w:t>Problem 1A – Single Year HDI Exploration (2022)</w:t>
+        <w:t xml:space="preserve">Problem 1A </w:t>
+      </w:r>
+    </w:p>
+    <w:p>
+      <w:pPr>
+        <w:spacing w:before="100" w:beforeAutospacing="1" w:after="100" w:afterAutospacing="1" w:line="240" w:lineRule="auto"/>
+        <w:outlineLvl w:val="1"/>
+        <w:rPr>
+          <w:rFonts w:ascii="Times New Roman" w:eastAsia="Times New Roman" w:hAnsi="Times New Roman" w:cs="Times New Roman"/>
+          <w:b/>
+          <w:bCs/>
+          <w:sz w:val="36"/>
+          <w:szCs w:val="36"/>
+        </w:rPr>
+      </w:pPr>
+      <w:r>
+        <w:rPr>
+          <w:rFonts w:ascii="Times New Roman" w:eastAsia="Times New Roman" w:hAnsi="Times New Roman" w:cs="Times New Roman"/>
+          <w:b/>
+          <w:bCs/>
+          <w:sz w:val="36"/>
+          <w:szCs w:val="36"/>
+        </w:rPr>
+        <w:t>Single Year HDI Exploration (2022)</w:t>
       </w:r>
       <w:bookmarkEnd w:id="1"/>
     </w:p>
@@ -1457,7 +1762,6 @@
           <w:sz w:val="24"/>
           <w:szCs w:val="24"/>
         </w:rPr>
-        <w:lastRenderedPageBreak/>
         <w:drawing>
           <wp:inline distT="0" distB="0" distL="0" distR="0" wp14:anchorId="74BA9275" wp14:editId="3491843F">
             <wp:extent cx="4429743" cy="3839111"/>
@@ -1604,7 +1908,25 @@
           <w:sz w:val="24"/>
           <w:szCs w:val="24"/>
         </w:rPr>
-        <w:t>A high HDI level indicates a relatively high Gross National Income (GNI) per capita in the nations, which is a clear sign of the connection between human development and economic prosperity. However, there are notable exceptions where nations are achieving relatively high HDI despite having relatively low income levels. It is crucial to remember that attainment of health and education is an essential component of human development that cannot be exclusively linked to economic prosperity.</w:t>
+        <w:t xml:space="preserve">A high HDI level indicates a relatively high Gross National Income (GNI) per capita in the nations, which is a clear sign of the connection between human development and economic prosperity. However, there are notable exceptions where nations are achieving relatively high HDI despite having relatively </w:t>
+      </w:r>
+      <w:proofErr w:type="gramStart"/>
+      <w:r>
+        <w:rPr>
+          <w:rFonts w:ascii="Times New Roman" w:eastAsia="Times New Roman" w:hAnsi="Times New Roman" w:cs="Times New Roman"/>
+          <w:sz w:val="24"/>
+          <w:szCs w:val="24"/>
+        </w:rPr>
+        <w:t>low income</w:t>
+      </w:r>
+      <w:proofErr w:type="gramEnd"/>
+      <w:r>
+        <w:rPr>
+          <w:rFonts w:ascii="Times New Roman" w:eastAsia="Times New Roman" w:hAnsi="Times New Roman" w:cs="Times New Roman"/>
+          <w:sz w:val="24"/>
+          <w:szCs w:val="24"/>
+        </w:rPr>
+        <w:t xml:space="preserve"> levels. It is crucial to remember that attainment of health and education is an essential component of human development that cannot be exclusively linked to economic prosperity.</w:t>
       </w:r>
     </w:p>
     <w:p>
@@ -1674,53 +1996,166 @@
           <w:sz w:val="36"/>
           <w:szCs w:val="36"/>
         </w:rPr>
-        <w:t>Problem 1B – HDI Trend Analysis (2020–2022)</w:t>
-      </w:r>
-    </w:p>
-    <w:p>
-      <w:pPr>
-        <w:spacing w:before="100" w:beforeAutospacing="1" w:after="100" w:afterAutospacing="1" w:line="240" w:lineRule="auto"/>
-        <w:rPr>
-          <w:rFonts w:ascii="Times New Roman" w:eastAsia="Times New Roman" w:hAnsi="Times New Roman" w:cs="Times New Roman"/>
-          <w:sz w:val="24"/>
-          <w:szCs w:val="24"/>
-        </w:rPr>
-      </w:pPr>
-      <w:r>
+        <w:t xml:space="preserve">Problem 1B </w:t>
+      </w:r>
+    </w:p>
+    <w:p>
+      <w:pPr>
+        <w:spacing w:before="100" w:beforeAutospacing="1" w:after="100" w:afterAutospacing="1" w:line="240" w:lineRule="auto"/>
         <w:rPr>
           <w:rFonts w:ascii="Times New Roman" w:eastAsia="Times New Roman" w:hAnsi="Times New Roman" w:cs="Times New Roman"/>
           <w:b/>
           <w:bCs/>
-          <w:sz w:val="24"/>
-          <w:szCs w:val="24"/>
-        </w:rPr>
-        <w:t>Methods:</w:t>
-      </w:r>
-      <w:r>
-        <w:rPr>
-          <w:rFonts w:ascii="Times New Roman" w:eastAsia="Times New Roman" w:hAnsi="Times New Roman" w:cs="Times New Roman"/>
-          <w:sz w:val="24"/>
-          <w:szCs w:val="24"/>
-        </w:rPr>
-        <w:t xml:space="preserve"> Subset created for 2020–2022, cleaned, and visualized.</w:t>
-      </w:r>
-      <w:r>
-        <w:rPr>
-          <w:rFonts w:ascii="Times New Roman" w:eastAsia="Times New Roman" w:hAnsi="Times New Roman" w:cs="Times New Roman"/>
-          <w:sz w:val="24"/>
-          <w:szCs w:val="24"/>
-        </w:rPr>
-        <w:br/>
-      </w:r>
+          <w:sz w:val="36"/>
+          <w:szCs w:val="36"/>
+        </w:rPr>
+      </w:pPr>
       <w:r>
         <w:rPr>
           <w:rFonts w:ascii="Times New Roman" w:eastAsia="Times New Roman" w:hAnsi="Times New Roman" w:cs="Times New Roman"/>
           <w:b/>
           <w:bCs/>
-          <w:sz w:val="24"/>
-          <w:szCs w:val="24"/>
-        </w:rPr>
-        <w:t>Figures:</w:t>
+          <w:sz w:val="36"/>
+          <w:szCs w:val="36"/>
+        </w:rPr>
+        <w:t>HDI Trend Analysis (2020–2022)</w:t>
+      </w:r>
+    </w:p>
+    <w:p>
+      <w:pPr>
+        <w:spacing w:before="100" w:beforeAutospacing="1" w:after="100" w:afterAutospacing="1" w:line="240" w:lineRule="auto"/>
+        <w:rPr>
+          <w:rFonts w:ascii="Times New Roman" w:eastAsia="Times New Roman" w:hAnsi="Times New Roman" w:cs="Times New Roman"/>
+          <w:sz w:val="24"/>
+          <w:szCs w:val="24"/>
+        </w:rPr>
+      </w:pPr>
+      <w:r>
+        <w:rPr>
+          <w:rFonts w:ascii="Times New Roman" w:eastAsia="Times New Roman" w:hAnsi="Times New Roman" w:cs="Times New Roman"/>
+          <w:b/>
+          <w:bCs/>
+          <w:sz w:val="24"/>
+          <w:szCs w:val="24"/>
+        </w:rPr>
+        <w:t>Methods / Approach:</w:t>
+      </w:r>
+      <w:r>
+        <w:rPr>
+          <w:rFonts w:ascii="Times New Roman" w:eastAsia="Times New Roman" w:hAnsi="Times New Roman" w:cs="Times New Roman"/>
+          <w:sz w:val="24"/>
+          <w:szCs w:val="24"/>
+        </w:rPr>
+        <w:br/>
+        <w:t>Data for 2020–2022 was extracted, cleaned, and visualized to examine HDI changes, regional averages, distributions, and the HDI–GNI relationship.</w:t>
+      </w:r>
+    </w:p>
+    <w:p>
+      <w:pPr>
+        <w:spacing w:before="100" w:beforeAutospacing="1" w:after="100" w:afterAutospacing="1" w:line="240" w:lineRule="auto"/>
+        <w:rPr>
+          <w:rFonts w:ascii="Times New Roman" w:eastAsia="Times New Roman" w:hAnsi="Times New Roman" w:cs="Times New Roman"/>
+          <w:sz w:val="24"/>
+          <w:szCs w:val="24"/>
+        </w:rPr>
+      </w:pPr>
+      <w:r>
+        <w:rPr>
+          <w:rFonts w:ascii="Times New Roman" w:eastAsia="Times New Roman" w:hAnsi="Times New Roman" w:cs="Times New Roman"/>
+          <w:b/>
+          <w:bCs/>
+          <w:sz w:val="24"/>
+          <w:szCs w:val="24"/>
+        </w:rPr>
+        <w:t>Key Results:</w:t>
+      </w:r>
+    </w:p>
+    <w:p>
+      <w:pPr>
+        <w:numPr>
+          <w:ilvl w:val="0"/>
+          <w:numId w:val="15"/>
+        </w:numPr>
+        <w:spacing w:before="100" w:beforeAutospacing="1" w:after="100" w:afterAutospacing="1" w:line="240" w:lineRule="auto"/>
+        <w:rPr>
+          <w:rFonts w:ascii="Times New Roman" w:eastAsia="Times New Roman" w:hAnsi="Times New Roman" w:cs="Times New Roman"/>
+          <w:sz w:val="24"/>
+          <w:szCs w:val="24"/>
+        </w:rPr>
+      </w:pPr>
+      <w:r>
+        <w:rPr>
+          <w:rFonts w:ascii="Times New Roman" w:eastAsia="Times New Roman" w:hAnsi="Times New Roman" w:cs="Times New Roman"/>
+          <w:sz w:val="24"/>
+          <w:szCs w:val="24"/>
+        </w:rPr>
+        <w:t>Nepal, India, Sri Lanka, Bangladesh, and Bhutan showed gradual HDI improvement, though recovery rates varied.</w:t>
+      </w:r>
+    </w:p>
+    <w:p>
+      <w:pPr>
+        <w:numPr>
+          <w:ilvl w:val="0"/>
+          <w:numId w:val="15"/>
+        </w:numPr>
+        <w:spacing w:before="100" w:beforeAutospacing="1" w:after="100" w:afterAutospacing="1" w:line="240" w:lineRule="auto"/>
+        <w:rPr>
+          <w:rFonts w:ascii="Times New Roman" w:eastAsia="Times New Roman" w:hAnsi="Times New Roman" w:cs="Times New Roman"/>
+          <w:sz w:val="24"/>
+          <w:szCs w:val="24"/>
+        </w:rPr>
+      </w:pPr>
+      <w:r>
+        <w:rPr>
+          <w:rFonts w:ascii="Times New Roman" w:eastAsia="Times New Roman" w:hAnsi="Times New Roman" w:cs="Times New Roman"/>
+          <w:sz w:val="24"/>
+          <w:szCs w:val="24"/>
+        </w:rPr>
+        <w:t>Regional averages could not be generated due to dataset limitations.</w:t>
+      </w:r>
+    </w:p>
+    <w:p>
+      <w:pPr>
+        <w:numPr>
+          <w:ilvl w:val="0"/>
+          <w:numId w:val="15"/>
+        </w:numPr>
+        <w:spacing w:before="100" w:beforeAutospacing="1" w:after="100" w:afterAutospacing="1" w:line="240" w:lineRule="auto"/>
+        <w:rPr>
+          <w:rFonts w:ascii="Times New Roman" w:eastAsia="Times New Roman" w:hAnsi="Times New Roman" w:cs="Times New Roman"/>
+          <w:sz w:val="24"/>
+          <w:szCs w:val="24"/>
+        </w:rPr>
+      </w:pPr>
+      <w:r>
+        <w:rPr>
+          <w:rFonts w:ascii="Times New Roman" w:eastAsia="Times New Roman" w:hAnsi="Times New Roman" w:cs="Times New Roman"/>
+          <w:sz w:val="24"/>
+          <w:szCs w:val="24"/>
+        </w:rPr>
+        <w:t>Median HDI remained stable, but disparities widened.</w:t>
+      </w:r>
+    </w:p>
+    <w:p>
+      <w:pPr>
+        <w:numPr>
+          <w:ilvl w:val="0"/>
+          <w:numId w:val="15"/>
+        </w:numPr>
+        <w:spacing w:before="100" w:beforeAutospacing="1" w:after="100" w:afterAutospacing="1" w:line="240" w:lineRule="auto"/>
+        <w:rPr>
+          <w:rFonts w:ascii="Times New Roman" w:eastAsia="Times New Roman" w:hAnsi="Times New Roman" w:cs="Times New Roman"/>
+          <w:sz w:val="24"/>
+          <w:szCs w:val="24"/>
+        </w:rPr>
+      </w:pPr>
+      <w:r>
+        <w:rPr>
+          <w:rFonts w:ascii="Times New Roman" w:eastAsia="Times New Roman" w:hAnsi="Times New Roman" w:cs="Times New Roman"/>
+          <w:sz w:val="24"/>
+          <w:szCs w:val="24"/>
+        </w:rPr>
+        <w:t>HDI correlated positively with GNI, with notable outliers.</w:t>
       </w:r>
     </w:p>
     <w:p>
@@ -1835,6 +2270,7 @@
           <w:sz w:val="24"/>
           <w:szCs w:val="24"/>
         </w:rPr>
+        <w:lastRenderedPageBreak/>
         <w:t>This line chart indicates the HDI trends of Nepal, India, Sri Lanka, Bangladesh and Bhutan. The majority of countries demonstrate slow but steady development, but the rate varies, which is indicative of the differences in recovering the world disruptions like the COVID-19.</w:t>
       </w:r>
     </w:p>
@@ -1935,7 +2371,6 @@
         <w:rPr>
           <w:noProof/>
         </w:rPr>
-        <w:lastRenderedPageBreak/>
         <w:drawing>
           <wp:inline distT="0" distB="0" distL="0" distR="0" wp14:anchorId="148C265D" wp14:editId="1129EDFE">
             <wp:extent cx="5699760" cy="4381500"/>
@@ -2254,43 +2689,168 @@
           <w:szCs w:val="36"/>
         </w:rPr>
         <w:lastRenderedPageBreak/>
-        <w:t>Problem 2 – Advanced HDI Exploration (South Asia)</w:t>
-      </w:r>
-      <w:bookmarkEnd w:id="2"/>
-    </w:p>
-    <w:p>
-      <w:pPr>
-        <w:rPr>
-          <w:rFonts w:ascii="Times New Roman" w:eastAsia="Times New Roman" w:hAnsi="Times New Roman" w:cs="Times New Roman"/>
-          <w:sz w:val="24"/>
-          <w:szCs w:val="24"/>
-        </w:rPr>
-      </w:pPr>
-      <w:r>
+        <w:t xml:space="preserve">Problem 2 </w:t>
+      </w:r>
+    </w:p>
+    <w:p>
+      <w:pPr>
+        <w:spacing w:before="100" w:beforeAutospacing="1" w:after="100" w:afterAutospacing="1" w:line="240" w:lineRule="auto"/>
+        <w:outlineLvl w:val="1"/>
         <w:rPr>
           <w:rFonts w:ascii="Times New Roman" w:eastAsia="Times New Roman" w:hAnsi="Times New Roman" w:cs="Times New Roman"/>
           <w:b/>
           <w:bCs/>
-          <w:sz w:val="24"/>
-          <w:szCs w:val="24"/>
-        </w:rPr>
-        <w:t>Methods:</w:t>
-      </w:r>
-      <w:r>
-        <w:rPr>
-          <w:rFonts w:ascii="Times New Roman" w:eastAsia="Times New Roman" w:hAnsi="Times New Roman" w:cs="Times New Roman"/>
-          <w:sz w:val="24"/>
-          <w:szCs w:val="24"/>
-        </w:rPr>
-        <w:t xml:space="preserve"> </w:t>
-      </w:r>
-      <w:r>
-        <w:rPr>
-          <w:rFonts w:ascii="Times New Roman" w:eastAsia="Times New Roman" w:hAnsi="Times New Roman" w:cs="Times New Roman"/>
-          <w:sz w:val="24"/>
-          <w:szCs w:val="24"/>
-        </w:rPr>
-        <w:t>GNI and normalized life expectancy were used to construct a composite score for South Asia; outliers were identified; correlations were examined; and gap analysis was carried out.</w:t>
+          <w:sz w:val="36"/>
+          <w:szCs w:val="36"/>
+        </w:rPr>
+      </w:pPr>
+      <w:r>
+        <w:rPr>
+          <w:rFonts w:ascii="Times New Roman" w:eastAsia="Times New Roman" w:hAnsi="Times New Roman" w:cs="Times New Roman"/>
+          <w:b/>
+          <w:bCs/>
+          <w:sz w:val="36"/>
+          <w:szCs w:val="36"/>
+        </w:rPr>
+        <w:t>Advanced HDI Exploration (South Asia)</w:t>
+      </w:r>
+      <w:bookmarkEnd w:id="2"/>
+    </w:p>
+    <w:p>
+      <w:pPr>
+        <w:spacing w:before="100" w:beforeAutospacing="1" w:after="100" w:afterAutospacing="1" w:line="240" w:lineRule="auto"/>
+        <w:rPr>
+          <w:rFonts w:ascii="Times New Roman" w:eastAsia="Times New Roman" w:hAnsi="Times New Roman" w:cs="Times New Roman"/>
+          <w:sz w:val="24"/>
+          <w:szCs w:val="24"/>
+        </w:rPr>
+      </w:pPr>
+      <w:r>
+        <w:rPr>
+          <w:rFonts w:ascii="Times New Roman" w:eastAsia="Times New Roman" w:hAnsi="Times New Roman" w:cs="Times New Roman"/>
+          <w:b/>
+          <w:bCs/>
+          <w:sz w:val="24"/>
+          <w:szCs w:val="24"/>
+        </w:rPr>
+        <w:t>Methods / Approach:</w:t>
+      </w:r>
+      <w:r>
+        <w:rPr>
+          <w:rFonts w:ascii="Times New Roman" w:eastAsia="Times New Roman" w:hAnsi="Times New Roman" w:cs="Times New Roman"/>
+          <w:sz w:val="24"/>
+          <w:szCs w:val="24"/>
+        </w:rPr>
+        <w:br/>
+        <w:t>A composite score was built using GNI per capita and normalized life expectancy. Outliers in HDI vs GNI were identified, and correlations with gender development and life expectancy were examined. A gap analysis compared income and HDI performance.</w:t>
+      </w:r>
+    </w:p>
+    <w:p>
+      <w:pPr>
+        <w:spacing w:before="100" w:beforeAutospacing="1" w:after="100" w:afterAutospacing="1" w:line="240" w:lineRule="auto"/>
+        <w:rPr>
+          <w:rFonts w:ascii="Times New Roman" w:eastAsia="Times New Roman" w:hAnsi="Times New Roman" w:cs="Times New Roman"/>
+          <w:sz w:val="24"/>
+          <w:szCs w:val="24"/>
+        </w:rPr>
+      </w:pPr>
+      <w:r>
+        <w:rPr>
+          <w:rFonts w:ascii="Times New Roman" w:eastAsia="Times New Roman" w:hAnsi="Times New Roman" w:cs="Times New Roman"/>
+          <w:b/>
+          <w:bCs/>
+          <w:sz w:val="24"/>
+          <w:szCs w:val="24"/>
+        </w:rPr>
+        <w:t>Key Results:</w:t>
+      </w:r>
+    </w:p>
+    <w:p>
+      <w:pPr>
+        <w:numPr>
+          <w:ilvl w:val="0"/>
+          <w:numId w:val="16"/>
+        </w:numPr>
+        <w:spacing w:before="100" w:beforeAutospacing="1" w:after="100" w:afterAutospacing="1" w:line="240" w:lineRule="auto"/>
+        <w:rPr>
+          <w:rFonts w:ascii="Times New Roman" w:eastAsia="Times New Roman" w:hAnsi="Times New Roman" w:cs="Times New Roman"/>
+          <w:sz w:val="24"/>
+          <w:szCs w:val="24"/>
+        </w:rPr>
+      </w:pPr>
+      <w:r>
+        <w:rPr>
+          <w:rFonts w:ascii="Times New Roman" w:eastAsia="Times New Roman" w:hAnsi="Times New Roman" w:cs="Times New Roman"/>
+          <w:sz w:val="24"/>
+          <w:szCs w:val="24"/>
+        </w:rPr>
+        <w:t>Maldives and Sri Lanka ranked highest by composite score.</w:t>
+      </w:r>
+    </w:p>
+    <w:p>
+      <w:pPr>
+        <w:numPr>
+          <w:ilvl w:val="0"/>
+          <w:numId w:val="16"/>
+        </w:numPr>
+        <w:spacing w:before="100" w:beforeAutospacing="1" w:after="100" w:afterAutospacing="1" w:line="240" w:lineRule="auto"/>
+        <w:rPr>
+          <w:rFonts w:ascii="Times New Roman" w:eastAsia="Times New Roman" w:hAnsi="Times New Roman" w:cs="Times New Roman"/>
+          <w:sz w:val="24"/>
+          <w:szCs w:val="24"/>
+        </w:rPr>
+      </w:pPr>
+      <w:r>
+        <w:rPr>
+          <w:rFonts w:ascii="Times New Roman" w:eastAsia="Times New Roman" w:hAnsi="Times New Roman" w:cs="Times New Roman"/>
+          <w:sz w:val="24"/>
+          <w:szCs w:val="24"/>
+        </w:rPr>
+        <w:t>Outliers showed either efficient development despite low income or underperformance despite wealth.</w:t>
+      </w:r>
+    </w:p>
+    <w:p>
+      <w:pPr>
+        <w:numPr>
+          <w:ilvl w:val="0"/>
+          <w:numId w:val="16"/>
+        </w:numPr>
+        <w:spacing w:before="100" w:beforeAutospacing="1" w:after="100" w:afterAutospacing="1" w:line="240" w:lineRule="auto"/>
+        <w:rPr>
+          <w:rFonts w:ascii="Times New Roman" w:eastAsia="Times New Roman" w:hAnsi="Times New Roman" w:cs="Times New Roman"/>
+          <w:sz w:val="24"/>
+          <w:szCs w:val="24"/>
+        </w:rPr>
+      </w:pPr>
+      <w:r>
+        <w:rPr>
+          <w:rFonts w:ascii="Times New Roman" w:eastAsia="Times New Roman" w:hAnsi="Times New Roman" w:cs="Times New Roman"/>
+          <w:sz w:val="24"/>
+          <w:szCs w:val="24"/>
+        </w:rPr>
+        <w:t>Strong positive correlations were found between HDI and both gender development and life expectancy.</w:t>
+      </w:r>
+    </w:p>
+    <w:p>
+      <w:pPr>
+        <w:numPr>
+          <w:ilvl w:val="0"/>
+          <w:numId w:val="16"/>
+        </w:numPr>
+        <w:spacing w:before="100" w:beforeAutospacing="1" w:after="100" w:afterAutospacing="1" w:line="240" w:lineRule="auto"/>
+        <w:rPr>
+          <w:rFonts w:ascii="Times New Roman" w:eastAsia="Times New Roman" w:hAnsi="Times New Roman" w:cs="Times New Roman"/>
+          <w:sz w:val="24"/>
+          <w:szCs w:val="24"/>
+        </w:rPr>
+      </w:pPr>
+      <w:r>
+        <w:rPr>
+          <w:rFonts w:ascii="Times New Roman" w:eastAsia="Times New Roman" w:hAnsi="Times New Roman" w:cs="Times New Roman"/>
+          <w:sz w:val="24"/>
+          <w:szCs w:val="24"/>
+        </w:rPr>
+        <w:t>Gap analysis revealed underutilized wealth in some nations and efficient conversion in others</w:t>
       </w:r>
     </w:p>
     <w:p>
@@ -2433,6 +2993,7 @@
           <w:sz w:val="24"/>
           <w:szCs w:val="24"/>
         </w:rPr>
+        <w:lastRenderedPageBreak/>
         <w:t>It is a horizontal bar chart of the countries in South Asia with a composite of income and life expectancy. There is a strong level of health and income performance in Maldives and Sri Lanka.</w:t>
       </w:r>
     </w:p>
@@ -2482,7 +3043,6 @@
         <w:rPr>
           <w:noProof/>
         </w:rPr>
-        <w:lastRenderedPageBreak/>
         <w:drawing>
           <wp:inline distT="0" distB="0" distL="0" distR="0" wp14:anchorId="224051FF" wp14:editId="525C1059">
             <wp:extent cx="5943600" cy="4011295"/>
@@ -3061,43 +3621,236 @@
           <w:szCs w:val="36"/>
         </w:rPr>
         <w:lastRenderedPageBreak/>
-        <w:t>Problem 3 – Comparative Regional Analysis (South Asia vs Middle East)</w:t>
-      </w:r>
-      <w:bookmarkEnd w:id="3"/>
-    </w:p>
-    <w:p>
-      <w:pPr>
-        <w:rPr>
-          <w:rFonts w:ascii="Times New Roman" w:eastAsia="Times New Roman" w:hAnsi="Times New Roman" w:cs="Times New Roman"/>
-          <w:sz w:val="24"/>
-          <w:szCs w:val="24"/>
-        </w:rPr>
-      </w:pPr>
-      <w:r>
+        <w:t xml:space="preserve">Problem 3 </w:t>
+      </w:r>
+    </w:p>
+    <w:p>
+      <w:pPr>
+        <w:spacing w:before="100" w:beforeAutospacing="1" w:after="100" w:afterAutospacing="1" w:line="240" w:lineRule="auto"/>
+        <w:outlineLvl w:val="1"/>
         <w:rPr>
           <w:rFonts w:ascii="Times New Roman" w:eastAsia="Times New Roman" w:hAnsi="Times New Roman" w:cs="Times New Roman"/>
           <w:b/>
           <w:bCs/>
-          <w:sz w:val="24"/>
-          <w:szCs w:val="24"/>
-        </w:rPr>
-        <w:t>Methods:</w:t>
-      </w:r>
-      <w:r>
-        <w:rPr>
-          <w:rFonts w:ascii="Times New Roman" w:eastAsia="Times New Roman" w:hAnsi="Times New Roman" w:cs="Times New Roman"/>
-          <w:sz w:val="24"/>
-          <w:szCs w:val="24"/>
-        </w:rPr>
-        <w:t xml:space="preserve"> </w:t>
-      </w:r>
-      <w:r>
-        <w:rPr>
-          <w:rFonts w:ascii="Times New Roman" w:eastAsia="Times New Roman" w:hAnsi="Times New Roman" w:cs="Times New Roman"/>
-          <w:sz w:val="24"/>
-          <w:szCs w:val="24"/>
-        </w:rPr>
-        <w:t>Descriptive statistics, rankings, metric comparisons, disparity measures, correlations, and outlier detection were carried out for the two regions.</w:t>
+          <w:sz w:val="36"/>
+          <w:szCs w:val="36"/>
+        </w:rPr>
+      </w:pPr>
+      <w:r>
+        <w:rPr>
+          <w:rFonts w:ascii="Times New Roman" w:eastAsia="Times New Roman" w:hAnsi="Times New Roman" w:cs="Times New Roman"/>
+          <w:b/>
+          <w:bCs/>
+          <w:sz w:val="36"/>
+          <w:szCs w:val="36"/>
+        </w:rPr>
+        <w:t>Comparative Regional Analysis (South Asia vs Middle East)</w:t>
+      </w:r>
+      <w:bookmarkEnd w:id="3"/>
+    </w:p>
+    <w:p>
+      <w:pPr>
+        <w:spacing w:before="100" w:beforeAutospacing="1" w:after="100" w:afterAutospacing="1" w:line="240" w:lineRule="auto"/>
+        <w:rPr>
+          <w:rFonts w:ascii="Times New Roman" w:eastAsia="Times New Roman" w:hAnsi="Times New Roman" w:cs="Times New Roman"/>
+          <w:sz w:val="24"/>
+          <w:szCs w:val="24"/>
+        </w:rPr>
+      </w:pPr>
+      <w:r>
+        <w:rPr>
+          <w:rFonts w:ascii="Times New Roman" w:eastAsia="Times New Roman" w:hAnsi="Times New Roman" w:cs="Times New Roman"/>
+          <w:sz w:val="24"/>
+          <w:szCs w:val="24"/>
+        </w:rPr>
+        <w:t>Data for both regions was extracted and cleaned. Descriptive statistics, rankings, and comparative metrics (gender development, life expectancy, GNI per capita) were calculated. Visualizations included bar charts, regression plots, and scatter plots to highlight disparities, correlations, and outliers.</w:t>
+      </w:r>
+    </w:p>
+    <w:p>
+      <w:pPr>
+        <w:spacing w:before="100" w:beforeAutospacing="1" w:after="100" w:afterAutospacing="1" w:line="240" w:lineRule="auto"/>
+        <w:rPr>
+          <w:rFonts w:ascii="Times New Roman" w:eastAsia="Times New Roman" w:hAnsi="Times New Roman" w:cs="Times New Roman"/>
+          <w:sz w:val="24"/>
+          <w:szCs w:val="24"/>
+        </w:rPr>
+      </w:pPr>
+      <w:r>
+        <w:rPr>
+          <w:rFonts w:ascii="Times New Roman" w:eastAsia="Times New Roman" w:hAnsi="Times New Roman" w:cs="Times New Roman"/>
+          <w:sz w:val="24"/>
+          <w:szCs w:val="24"/>
+        </w:rPr>
+        <w:t>Key Results</w:t>
+      </w:r>
+    </w:p>
+    <w:p>
+      <w:pPr>
+        <w:numPr>
+          <w:ilvl w:val="0"/>
+          <w:numId w:val="17"/>
+        </w:numPr>
+        <w:spacing w:before="100" w:beforeAutospacing="1" w:after="100" w:afterAutospacing="1" w:line="240" w:lineRule="auto"/>
+        <w:rPr>
+          <w:rFonts w:ascii="Times New Roman" w:eastAsia="Times New Roman" w:hAnsi="Times New Roman" w:cs="Times New Roman"/>
+          <w:sz w:val="24"/>
+          <w:szCs w:val="24"/>
+        </w:rPr>
+      </w:pPr>
+      <w:r>
+        <w:rPr>
+          <w:rFonts w:ascii="Times New Roman" w:eastAsia="Times New Roman" w:hAnsi="Times New Roman" w:cs="Times New Roman"/>
+          <w:b/>
+          <w:bCs/>
+          <w:sz w:val="24"/>
+          <w:szCs w:val="24"/>
+        </w:rPr>
+        <w:t>Top performers:</w:t>
+      </w:r>
+      <w:r>
+        <w:rPr>
+          <w:rFonts w:ascii="Times New Roman" w:eastAsia="Times New Roman" w:hAnsi="Times New Roman" w:cs="Times New Roman"/>
+          <w:sz w:val="24"/>
+          <w:szCs w:val="24"/>
+        </w:rPr>
+        <w:t xml:space="preserve"> UAE, Israel, and Bahrain in the Middle East; Sri Lanka, Maldives, and Bhutan in South Asia.</w:t>
+      </w:r>
+    </w:p>
+    <w:p>
+      <w:pPr>
+        <w:numPr>
+          <w:ilvl w:val="0"/>
+          <w:numId w:val="17"/>
+        </w:numPr>
+        <w:spacing w:before="100" w:beforeAutospacing="1" w:after="100" w:afterAutospacing="1" w:line="240" w:lineRule="auto"/>
+        <w:rPr>
+          <w:rFonts w:ascii="Times New Roman" w:eastAsia="Times New Roman" w:hAnsi="Times New Roman" w:cs="Times New Roman"/>
+          <w:sz w:val="24"/>
+          <w:szCs w:val="24"/>
+        </w:rPr>
+      </w:pPr>
+      <w:r>
+        <w:rPr>
+          <w:rFonts w:ascii="Times New Roman" w:eastAsia="Times New Roman" w:hAnsi="Times New Roman" w:cs="Times New Roman"/>
+          <w:b/>
+          <w:bCs/>
+          <w:sz w:val="24"/>
+          <w:szCs w:val="24"/>
+        </w:rPr>
+        <w:t>Bottom performers:</w:t>
+      </w:r>
+      <w:r>
+        <w:rPr>
+          <w:rFonts w:ascii="Times New Roman" w:eastAsia="Times New Roman" w:hAnsi="Times New Roman" w:cs="Times New Roman"/>
+          <w:sz w:val="24"/>
+          <w:szCs w:val="24"/>
+        </w:rPr>
+        <w:t xml:space="preserve"> Afghanistan, Pakistan, and Nepal in South Asia; Yemen, Syria, and Iraq in the Middle East.</w:t>
+      </w:r>
+    </w:p>
+    <w:p>
+      <w:pPr>
+        <w:numPr>
+          <w:ilvl w:val="0"/>
+          <w:numId w:val="17"/>
+        </w:numPr>
+        <w:spacing w:before="100" w:beforeAutospacing="1" w:after="100" w:afterAutospacing="1" w:line="240" w:lineRule="auto"/>
+        <w:rPr>
+          <w:rFonts w:ascii="Times New Roman" w:eastAsia="Times New Roman" w:hAnsi="Times New Roman" w:cs="Times New Roman"/>
+          <w:sz w:val="24"/>
+          <w:szCs w:val="24"/>
+        </w:rPr>
+      </w:pPr>
+      <w:r>
+        <w:rPr>
+          <w:rFonts w:ascii="Times New Roman" w:eastAsia="Times New Roman" w:hAnsi="Times New Roman" w:cs="Times New Roman"/>
+          <w:b/>
+          <w:bCs/>
+          <w:sz w:val="24"/>
+          <w:szCs w:val="24"/>
+        </w:rPr>
+        <w:t>Metric comparison:</w:t>
+      </w:r>
+      <w:r>
+        <w:rPr>
+          <w:rFonts w:ascii="Times New Roman" w:eastAsia="Times New Roman" w:hAnsi="Times New Roman" w:cs="Times New Roman"/>
+          <w:sz w:val="24"/>
+          <w:szCs w:val="24"/>
+        </w:rPr>
+        <w:t xml:space="preserve"> Middle Eastern countries generally showed higher GNI and life expectancy averages, while South Asia lagged.</w:t>
+      </w:r>
+    </w:p>
+    <w:p>
+      <w:pPr>
+        <w:numPr>
+          <w:ilvl w:val="0"/>
+          <w:numId w:val="17"/>
+        </w:numPr>
+        <w:spacing w:before="100" w:beforeAutospacing="1" w:after="100" w:afterAutospacing="1" w:line="240" w:lineRule="auto"/>
+        <w:rPr>
+          <w:rFonts w:ascii="Times New Roman" w:eastAsia="Times New Roman" w:hAnsi="Times New Roman" w:cs="Times New Roman"/>
+          <w:sz w:val="24"/>
+          <w:szCs w:val="24"/>
+        </w:rPr>
+      </w:pPr>
+      <w:r>
+        <w:rPr>
+          <w:rFonts w:ascii="Times New Roman" w:eastAsia="Times New Roman" w:hAnsi="Times New Roman" w:cs="Times New Roman"/>
+          <w:b/>
+          <w:bCs/>
+          <w:sz w:val="24"/>
+          <w:szCs w:val="24"/>
+        </w:rPr>
+        <w:t>Correlations:</w:t>
+      </w:r>
+      <w:r>
+        <w:rPr>
+          <w:rFonts w:ascii="Times New Roman" w:eastAsia="Times New Roman" w:hAnsi="Times New Roman" w:cs="Times New Roman"/>
+          <w:sz w:val="24"/>
+          <w:szCs w:val="24"/>
+        </w:rPr>
+        <w:t xml:space="preserve"> Stronger link between gender development and HDI in the Middle East; moderate but positive in South Asia.</w:t>
+      </w:r>
+    </w:p>
+    <w:p>
+      <w:pPr>
+        <w:numPr>
+          <w:ilvl w:val="0"/>
+          <w:numId w:val="17"/>
+        </w:numPr>
+        <w:spacing w:before="100" w:beforeAutospacing="1" w:after="100" w:afterAutospacing="1" w:line="240" w:lineRule="auto"/>
+        <w:rPr>
+          <w:rFonts w:ascii="Times New Roman" w:eastAsia="Times New Roman" w:hAnsi="Times New Roman" w:cs="Times New Roman"/>
+          <w:sz w:val="24"/>
+          <w:szCs w:val="24"/>
+        </w:rPr>
+      </w:pPr>
+      <w:r>
+        <w:rPr>
+          <w:rFonts w:ascii="Times New Roman" w:eastAsia="Times New Roman" w:hAnsi="Times New Roman" w:cs="Times New Roman"/>
+          <w:b/>
+          <w:bCs/>
+          <w:sz w:val="24"/>
+          <w:szCs w:val="24"/>
+        </w:rPr>
+        <w:t>Outliers:</w:t>
+      </w:r>
+      <w:r>
+        <w:rPr>
+          <w:rFonts w:ascii="Times New Roman" w:eastAsia="Times New Roman" w:hAnsi="Times New Roman" w:cs="Times New Roman"/>
+          <w:sz w:val="24"/>
+          <w:szCs w:val="24"/>
+        </w:rPr>
+        <w:t xml:space="preserve"> Some resource</w:t>
+      </w:r>
+      <w:r>
+        <w:rPr>
+          <w:rFonts w:ascii="Times New Roman" w:eastAsia="Times New Roman" w:hAnsi="Times New Roman" w:cs="Times New Roman"/>
+          <w:sz w:val="24"/>
+          <w:szCs w:val="24"/>
+        </w:rPr>
+        <w:noBreakHyphen/>
+        <w:t>rich Middle Eastern states underperformed in HDI relative to income, while certain South Asian nations achieved higher HDI despite modest GNI.</w:t>
       </w:r>
     </w:p>
     <w:p>
@@ -3280,6 +4033,7 @@
           <w:sz w:val="24"/>
           <w:szCs w:val="24"/>
         </w:rPr>
+        <w:lastRenderedPageBreak/>
         <w:t>Figure 11.</w:t>
       </w:r>
       <w:r>
@@ -3305,7 +4059,6 @@
         <w:rPr>
           <w:noProof/>
         </w:rPr>
-        <w:lastRenderedPageBreak/>
         <w:drawing>
           <wp:inline distT="0" distB="0" distL="0" distR="0" wp14:anchorId="06E084FC" wp14:editId="478BAA22">
             <wp:extent cx="5943600" cy="2924175"/>
@@ -4174,29 +4927,72 @@
     </w:p>
     <w:p>
       <w:pPr>
-        <w:spacing w:before="100" w:beforeAutospacing="1" w:after="100" w:afterAutospacing="1" w:line="240" w:lineRule="auto"/>
-        <w:rPr>
-          <w:rFonts w:ascii="Times New Roman" w:eastAsia="Times New Roman" w:hAnsi="Times New Roman" w:cs="Times New Roman"/>
-          <w:sz w:val="24"/>
-          <w:szCs w:val="24"/>
-        </w:rPr>
-      </w:pPr>
-      <w:r>
-        <w:rPr>
-          <w:rFonts w:ascii="Times New Roman" w:eastAsia="Times New Roman" w:hAnsi="Times New Roman" w:cs="Times New Roman"/>
-          <w:sz w:val="24"/>
-          <w:szCs w:val="24"/>
-        </w:rPr>
-        <w:t>This analysis demonstrates that HDI is shaped by more than income: health and education are critical drivers. South Asia shows progress but lags behind the Middle East, with notable outliers highlighting inefficiencies and strengths. Global events like COVID</w:t>
-      </w:r>
-      <w:r>
-        <w:rPr>
-          <w:rFonts w:ascii="Times New Roman" w:eastAsia="Times New Roman" w:hAnsi="Times New Roman" w:cs="Times New Roman"/>
-          <w:sz w:val="24"/>
-          <w:szCs w:val="24"/>
-        </w:rPr>
+        <w:pStyle w:val="NormalWeb"/>
+      </w:pPr>
+      <w:r>
+        <w:rPr>
+          <w:b/>
+          <w:bCs/>
+        </w:rPr>
+        <w:t>Summary of Findings:</w:t>
+      </w:r>
+      <w:r>
+        <w:br/>
+        <w:t>The analysis shows that HDI generally improves with higher GNI per capita, but health and education outcomes are equally critical. South Asian countries demonstrate gradual progress, while Middle Eastern nations often achieve higher HDI due to stronger economic and social indicators. Outlier analysis highlights both inefficiencies in resource use and resilience in lower</w:t>
+      </w:r>
+      <w:r>
         <w:noBreakHyphen/>
-        <w:t>19 disrupted HDI trajectories, underscoring the need for resilient health and education systems. Limitations include absence of explicit region labels in the dataset and reliance on normalized indices for composite scores. Future work should integrate broader datasets and policy analysis to deepen insights.</w:t>
+        <w:t>income nations.</w:t>
+      </w:r>
+    </w:p>
+    <w:p>
+      <w:pPr>
+        <w:pStyle w:val="NormalWeb"/>
+      </w:pPr>
+      <w:r>
+        <w:rPr>
+          <w:rStyle w:val="Strong"/>
+        </w:rPr>
+        <w:t>Insights on HDI Trends and Disparities:</w:t>
+      </w:r>
+      <w:r>
+        <w:br/>
+        <w:t>Between 2020 and 2022, HDI trends reveal uneven recovery from COVID</w:t>
+      </w:r>
+      <w:r>
+        <w:noBreakHyphen/>
+        <w:t>19, with widening disparities across countries. Gender development and life expectancy consistently emerge as strong predictors of HDI, underscoring the multidimensional nature of human progress. Regional comparisons show persistent gaps between South Asia and the Middle East, particularly in income and health outcomes.</w:t>
+      </w:r>
+    </w:p>
+    <w:p>
+      <w:pPr>
+        <w:pStyle w:val="NormalWeb"/>
+      </w:pPr>
+      <w:r>
+        <w:rPr>
+          <w:rStyle w:val="Strong"/>
+        </w:rPr>
+        <w:lastRenderedPageBreak/>
+        <w:t>Limitations:</w:t>
+      </w:r>
+      <w:r>
+        <w:br/>
+        <w:t>The dataset lacked explicit regional labels and some metrics, restricting the scope of regional averages and comparative analysis. Composite scores relied on normalized indices, which may oversimplify complex realities.</w:t>
+      </w:r>
+    </w:p>
+    <w:p>
+      <w:pPr>
+        <w:pStyle w:val="NormalWeb"/>
+      </w:pPr>
+      <w:r>
+        <w:rPr>
+          <w:rStyle w:val="Strong"/>
+        </w:rPr>
+        <w:t>Recommendations / Implications:</w:t>
+      </w:r>
+      <w:r>
+        <w:br/>
+        <w:t>Future research should integrate broader datasets with richer regional and policy variables to capture nuanced drivers of HDI. Policymakers should prioritize investments in health and education, alongside economic growth, to ensure balanced and resilient development. Addressing gender disparities and improving life expectancy remain essential strategies for advancing human development.</w:t>
       </w:r>
     </w:p>
     <w:p>
@@ -4318,6 +5114,71 @@
           <w:szCs w:val="24"/>
         </w:rPr>
         <w:t>.</w:t>
+      </w:r>
+    </w:p>
+    <w:p>
+      <w:pPr>
+        <w:spacing w:before="100" w:beforeAutospacing="1" w:after="100" w:afterAutospacing="1" w:line="240" w:lineRule="auto"/>
+        <w:ind w:left="720"/>
+        <w:rPr>
+          <w:rFonts w:ascii="Times New Roman" w:eastAsia="Times New Roman" w:hAnsi="Times New Roman" w:cs="Times New Roman"/>
+          <w:sz w:val="24"/>
+          <w:szCs w:val="24"/>
+        </w:rPr>
+      </w:pPr>
+    </w:p>
+    <w:p>
+      <w:pPr>
+        <w:spacing w:before="100" w:beforeAutospacing="1" w:after="100" w:afterAutospacing="1" w:line="240" w:lineRule="auto"/>
+        <w:ind w:left="720"/>
+        <w:rPr>
+          <w:rFonts w:ascii="Times New Roman" w:eastAsia="Times New Roman" w:hAnsi="Times New Roman" w:cs="Times New Roman"/>
+          <w:sz w:val="24"/>
+          <w:szCs w:val="24"/>
+        </w:rPr>
+      </w:pPr>
+      <w:r>
+        <w:rPr>
+          <w:rFonts w:ascii="Times New Roman" w:eastAsia="Times New Roman" w:hAnsi="Times New Roman" w:cs="Times New Roman"/>
+          <w:sz w:val="24"/>
+          <w:szCs w:val="24"/>
+        </w:rPr>
+        <w:lastRenderedPageBreak/>
+        <w:drawing>
+          <wp:inline distT="0" distB="0" distL="0" distR="0" wp14:anchorId="6B612FD9" wp14:editId="7F52FD1C">
+            <wp:extent cx="5943600" cy="5727700"/>
+            <wp:effectExtent l="0" t="0" r="0" b="6350"/>
+            <wp:docPr id="20" name="Picture 20"/>
+            <wp:cNvGraphicFramePr>
+              <a:graphicFrameLocks xmlns:a="http://schemas.openxmlformats.org/drawingml/2006/main" noChangeAspect="1"/>
+            </wp:cNvGraphicFramePr>
+            <a:graphic xmlns:a="http://schemas.openxmlformats.org/drawingml/2006/main">
+              <a:graphicData uri="http://schemas.openxmlformats.org/drawingml/2006/picture">
+                <pic:pic xmlns:pic="http://schemas.openxmlformats.org/drawingml/2006/picture">
+                  <pic:nvPicPr>
+                    <pic:cNvPr id="1" name=""/>
+                    <pic:cNvPicPr/>
+                  </pic:nvPicPr>
+                  <pic:blipFill>
+                    <a:blip r:embed="rId24"/>
+                    <a:stretch>
+                      <a:fillRect/>
+                    </a:stretch>
+                  </pic:blipFill>
+                  <pic:spPr>
+                    <a:xfrm>
+                      <a:off x="0" y="0"/>
+                      <a:ext cx="5943600" cy="5727700"/>
+                    </a:xfrm>
+                    <a:prstGeom prst="rect">
+                      <a:avLst/>
+                    </a:prstGeom>
+                  </pic:spPr>
+                </pic:pic>
+              </a:graphicData>
+            </a:graphic>
+          </wp:inline>
+        </w:drawing>
       </w:r>
     </w:p>
     <w:sectPr>
@@ -4333,6 +5194,147 @@
 <file path=word/numbering.xml><?xml version="1.0" encoding="utf-8"?>
 <w:numbering xmlns:wpc="http://schemas.microsoft.com/office/word/2010/wordprocessingCanvas" xmlns:cx="http://schemas.microsoft.com/office/drawing/2014/chartex" xmlns:cx1="http://schemas.microsoft.com/office/drawing/2015/9/8/chartex" xmlns:cx2="http://schemas.microsoft.com/office/drawing/2015/10/21/chartex" xmlns:cx3="http://schemas.microsoft.com/office/drawing/2016/5/9/chartex" xmlns:cx4="http://schemas.microsoft.com/office/drawing/2016/5/10/chartex" xmlns:cx5="http://schemas.microsoft.com/office/drawing/2016/5/11/chartex" xmlns:cx6="http://schemas.microsoft.com/office/drawing/2016/5/12/chartex" xmlns:cx7="http://schemas.microsoft.com/office/drawing/2016/5/13/chartex" xmlns:cx8="http://schemas.microsoft.com/office/drawing/2016/5/14/chartex" xmlns:mc="http://schemas.openxmlformats.org/markup-compatibility/2006" xmlns:aink="http://schemas.microsoft.com/office/drawing/2016/ink" xmlns:am3d="http://schemas.microsoft.com/office/drawing/2017/model3d" xmlns:o="urn:schemas-microsoft-com:office:office" xmlns:oel="http://schemas.microsoft.com/office/2019/extlst" xmlns:r="http://schemas.openxmlformats.org/officeDocument/2006/relationships" xmlns:m="http://schemas.openxmlformats.org/officeDocument/2006/math" xmlns:v="urn:schemas-microsoft-com:vml" xmlns:wp14="http://schemas.microsoft.com/office/word/2010/wordprocessingDrawing" xmlns:wp="http://schemas.openxmlformats.org/drawingml/2006/wordprocessingDrawing" xmlns:w10="urn:schemas-microsoft-com:office:word" xmlns:w="http://schemas.openxmlformats.org/wordprocessingml/2006/main" xmlns:w14="http://schemas.microsoft.com/office/word/2010/wordml" xmlns:w15="http://schemas.microsoft.com/office/word/2012/wordml" xmlns:w16cex="http://schemas.microsoft.com/office/word/2018/wordml/cex" xmlns:w16cid="http://schemas.microsoft.com/office/word/2016/wordml/cid" xmlns:w16="http://schemas.microsoft.com/office/word/2018/wordml" xmlns:w16sdtdh="http://schemas.microsoft.com/office/word/2020/wordml/sdtdatahash" xmlns:w16se="http://schemas.microsoft.com/office/word/2015/wordml/symex" xmlns:wpg="http://schemas.microsoft.com/office/word/2010/wordprocessingGroup" xmlns:wpi="http://schemas.microsoft.com/office/word/2010/wordprocessingInk" xmlns:wne="http://schemas.microsoft.com/office/word/2006/wordml" xmlns:wps="http://schemas.microsoft.com/office/word/2010/wordprocessingShape" mc:Ignorable="w14 w15 w16se w16cid w16 w16cex w16sdtdh wp14">
   <w:abstractNum w:abstractNumId="0" w15:restartNumberingAfterBreak="0">
+    <w:nsid w:val="0503651A"/>
+    <w:multiLevelType w:val="multilevel"/>
+    <w:tmpl w:val="C6BA5A02"/>
+    <w:lvl w:ilvl="0">
+      <w:start w:val="1"/>
+      <w:numFmt w:val="bullet"/>
+      <w:lvlText w:val=""/>
+      <w:lvlJc w:val="left"/>
+      <w:pPr>
+        <w:tabs>
+          <w:tab w:val="num" w:pos="720"/>
+        </w:tabs>
+        <w:ind w:left="720" w:hanging="360"/>
+      </w:pPr>
+      <w:rPr>
+        <w:rFonts w:ascii="Symbol" w:hAnsi="Symbol" w:hint="default"/>
+        <w:sz w:val="20"/>
+      </w:rPr>
+    </w:lvl>
+    <w:lvl w:ilvl="1" w:tentative="1">
+      <w:numFmt w:val="bullet"/>
+      <w:lvlText w:val="o"/>
+      <w:lvlJc w:val="left"/>
+      <w:pPr>
+        <w:tabs>
+          <w:tab w:val="num" w:pos="1440"/>
+        </w:tabs>
+        <w:ind w:left="1440" w:hanging="360"/>
+      </w:pPr>
+      <w:rPr>
+        <w:rFonts w:ascii="Courier New" w:hAnsi="Courier New" w:hint="default"/>
+        <w:sz w:val="20"/>
+      </w:rPr>
+    </w:lvl>
+    <w:lvl w:ilvl="2" w:tentative="1">
+      <w:numFmt w:val="bullet"/>
+      <w:lvlText w:val=""/>
+      <w:lvlJc w:val="left"/>
+      <w:pPr>
+        <w:tabs>
+          <w:tab w:val="num" w:pos="2160"/>
+        </w:tabs>
+        <w:ind w:left="2160" w:hanging="360"/>
+      </w:pPr>
+      <w:rPr>
+        <w:rFonts w:ascii="Wingdings" w:hAnsi="Wingdings" w:hint="default"/>
+        <w:sz w:val="20"/>
+      </w:rPr>
+    </w:lvl>
+    <w:lvl w:ilvl="3" w:tentative="1">
+      <w:numFmt w:val="bullet"/>
+      <w:lvlText w:val=""/>
+      <w:lvlJc w:val="left"/>
+      <w:pPr>
+        <w:tabs>
+          <w:tab w:val="num" w:pos="2880"/>
+        </w:tabs>
+        <w:ind w:left="2880" w:hanging="360"/>
+      </w:pPr>
+      <w:rPr>
+        <w:rFonts w:ascii="Wingdings" w:hAnsi="Wingdings" w:hint="default"/>
+        <w:sz w:val="20"/>
+      </w:rPr>
+    </w:lvl>
+    <w:lvl w:ilvl="4" w:tentative="1">
+      <w:numFmt w:val="bullet"/>
+      <w:lvlText w:val=""/>
+      <w:lvlJc w:val="left"/>
+      <w:pPr>
+        <w:tabs>
+          <w:tab w:val="num" w:pos="3600"/>
+        </w:tabs>
+        <w:ind w:left="3600" w:hanging="360"/>
+      </w:pPr>
+      <w:rPr>
+        <w:rFonts w:ascii="Wingdings" w:hAnsi="Wingdings" w:hint="default"/>
+        <w:sz w:val="20"/>
+      </w:rPr>
+    </w:lvl>
+    <w:lvl w:ilvl="5" w:tentative="1">
+      <w:numFmt w:val="bullet"/>
+      <w:lvlText w:val=""/>
+      <w:lvlJc w:val="left"/>
+      <w:pPr>
+        <w:tabs>
+          <w:tab w:val="num" w:pos="4320"/>
+        </w:tabs>
+        <w:ind w:left="4320" w:hanging="360"/>
+      </w:pPr>
+      <w:rPr>
+        <w:rFonts w:ascii="Wingdings" w:hAnsi="Wingdings" w:hint="default"/>
+        <w:sz w:val="20"/>
+      </w:rPr>
+    </w:lvl>
+    <w:lvl w:ilvl="6" w:tentative="1">
+      <w:numFmt w:val="bullet"/>
+      <w:lvlText w:val=""/>
+      <w:lvlJc w:val="left"/>
+      <w:pPr>
+        <w:tabs>
+          <w:tab w:val="num" w:pos="5040"/>
+        </w:tabs>
+        <w:ind w:left="5040" w:hanging="360"/>
+      </w:pPr>
+      <w:rPr>
+        <w:rFonts w:ascii="Wingdings" w:hAnsi="Wingdings" w:hint="default"/>
+        <w:sz w:val="20"/>
+      </w:rPr>
+    </w:lvl>
+    <w:lvl w:ilvl="7" w:tentative="1">
+      <w:numFmt w:val="bullet"/>
+      <w:lvlText w:val=""/>
+      <w:lvlJc w:val="left"/>
+      <w:pPr>
+        <w:tabs>
+          <w:tab w:val="num" w:pos="5760"/>
+        </w:tabs>
+        <w:ind w:left="5760" w:hanging="360"/>
+      </w:pPr>
+      <w:rPr>
+        <w:rFonts w:ascii="Wingdings" w:hAnsi="Wingdings" w:hint="default"/>
+        <w:sz w:val="20"/>
+      </w:rPr>
+    </w:lvl>
+    <w:lvl w:ilvl="8" w:tentative="1">
+      <w:numFmt w:val="bullet"/>
+      <w:lvlText w:val=""/>
+      <w:lvlJc w:val="left"/>
+      <w:pPr>
+        <w:tabs>
+          <w:tab w:val="num" w:pos="6480"/>
+        </w:tabs>
+        <w:ind w:left="6480" w:hanging="360"/>
+      </w:pPr>
+      <w:rPr>
+        <w:rFonts w:ascii="Wingdings" w:hAnsi="Wingdings" w:hint="default"/>
+        <w:sz w:val="20"/>
+      </w:rPr>
+    </w:lvl>
+  </w:abstractNum>
+  <w:abstractNum w:abstractNumId="1" w15:restartNumberingAfterBreak="0">
     <w:nsid w:val="0C18252F"/>
     <w:multiLevelType w:val="multilevel"/>
     <w:tmpl w:val="7B329156"/>
@@ -4473,7 +5475,7 @@
       </w:rPr>
     </w:lvl>
   </w:abstractNum>
-  <w:abstractNum w:abstractNumId="1" w15:restartNumberingAfterBreak="0">
+  <w:abstractNum w:abstractNumId="2" w15:restartNumberingAfterBreak="0">
     <w:nsid w:val="0CA30233"/>
     <w:multiLevelType w:val="multilevel"/>
     <w:tmpl w:val="1654D300"/>
@@ -4578,7 +5580,7 @@
       </w:pPr>
     </w:lvl>
   </w:abstractNum>
-  <w:abstractNum w:abstractNumId="2" w15:restartNumberingAfterBreak="0">
+  <w:abstractNum w:abstractNumId="3" w15:restartNumberingAfterBreak="0">
     <w:nsid w:val="16933859"/>
     <w:multiLevelType w:val="multilevel"/>
     <w:tmpl w:val="F1888996"/>
@@ -4719,7 +5721,7 @@
       </w:rPr>
     </w:lvl>
   </w:abstractNum>
-  <w:abstractNum w:abstractNumId="3" w15:restartNumberingAfterBreak="0">
+  <w:abstractNum w:abstractNumId="4" w15:restartNumberingAfterBreak="0">
     <w:nsid w:val="1B537640"/>
     <w:multiLevelType w:val="multilevel"/>
     <w:tmpl w:val="7D3CD704"/>
@@ -4860,7 +5862,112 @@
       </w:rPr>
     </w:lvl>
   </w:abstractNum>
-  <w:abstractNum w:abstractNumId="4" w15:restartNumberingAfterBreak="0">
+  <w:abstractNum w:abstractNumId="5" w15:restartNumberingAfterBreak="0">
+    <w:nsid w:val="22106726"/>
+    <w:multiLevelType w:val="multilevel"/>
+    <w:tmpl w:val="B0983BCC"/>
+    <w:lvl w:ilvl="0">
+      <w:start w:val="1"/>
+      <w:numFmt w:val="decimal"/>
+      <w:lvlText w:val="%1."/>
+      <w:lvlJc w:val="left"/>
+      <w:pPr>
+        <w:tabs>
+          <w:tab w:val="num" w:pos="720"/>
+        </w:tabs>
+        <w:ind w:left="720" w:hanging="360"/>
+      </w:pPr>
+    </w:lvl>
+    <w:lvl w:ilvl="1" w:tentative="1">
+      <w:numFmt w:val="decimal"/>
+      <w:lvlText w:val="%2."/>
+      <w:lvlJc w:val="left"/>
+      <w:pPr>
+        <w:tabs>
+          <w:tab w:val="num" w:pos="1440"/>
+        </w:tabs>
+        <w:ind w:left="1440" w:hanging="360"/>
+      </w:pPr>
+    </w:lvl>
+    <w:lvl w:ilvl="2" w:tentative="1">
+      <w:numFmt w:val="decimal"/>
+      <w:lvlText w:val="%3."/>
+      <w:lvlJc w:val="left"/>
+      <w:pPr>
+        <w:tabs>
+          <w:tab w:val="num" w:pos="2160"/>
+        </w:tabs>
+        <w:ind w:left="2160" w:hanging="360"/>
+      </w:pPr>
+    </w:lvl>
+    <w:lvl w:ilvl="3" w:tentative="1">
+      <w:numFmt w:val="decimal"/>
+      <w:lvlText w:val="%4."/>
+      <w:lvlJc w:val="left"/>
+      <w:pPr>
+        <w:tabs>
+          <w:tab w:val="num" w:pos="2880"/>
+        </w:tabs>
+        <w:ind w:left="2880" w:hanging="360"/>
+      </w:pPr>
+    </w:lvl>
+    <w:lvl w:ilvl="4" w:tentative="1">
+      <w:numFmt w:val="decimal"/>
+      <w:lvlText w:val="%5."/>
+      <w:lvlJc w:val="left"/>
+      <w:pPr>
+        <w:tabs>
+          <w:tab w:val="num" w:pos="3600"/>
+        </w:tabs>
+        <w:ind w:left="3600" w:hanging="360"/>
+      </w:pPr>
+    </w:lvl>
+    <w:lvl w:ilvl="5" w:tentative="1">
+      <w:numFmt w:val="decimal"/>
+      <w:lvlText w:val="%6."/>
+      <w:lvlJc w:val="left"/>
+      <w:pPr>
+        <w:tabs>
+          <w:tab w:val="num" w:pos="4320"/>
+        </w:tabs>
+        <w:ind w:left="4320" w:hanging="360"/>
+      </w:pPr>
+    </w:lvl>
+    <w:lvl w:ilvl="6" w:tentative="1">
+      <w:numFmt w:val="decimal"/>
+      <w:lvlText w:val="%7."/>
+      <w:lvlJc w:val="left"/>
+      <w:pPr>
+        <w:tabs>
+          <w:tab w:val="num" w:pos="5040"/>
+        </w:tabs>
+        <w:ind w:left="5040" w:hanging="360"/>
+      </w:pPr>
+    </w:lvl>
+    <w:lvl w:ilvl="7" w:tentative="1">
+      <w:numFmt w:val="decimal"/>
+      <w:lvlText w:val="%8."/>
+      <w:lvlJc w:val="left"/>
+      <w:pPr>
+        <w:tabs>
+          <w:tab w:val="num" w:pos="5760"/>
+        </w:tabs>
+        <w:ind w:left="5760" w:hanging="360"/>
+      </w:pPr>
+    </w:lvl>
+    <w:lvl w:ilvl="8" w:tentative="1">
+      <w:numFmt w:val="decimal"/>
+      <w:lvlText w:val="%9."/>
+      <w:lvlJc w:val="left"/>
+      <w:pPr>
+        <w:tabs>
+          <w:tab w:val="num" w:pos="6480"/>
+        </w:tabs>
+        <w:ind w:left="6480" w:hanging="360"/>
+      </w:pPr>
+    </w:lvl>
+  </w:abstractNum>
+  <w:abstractNum w:abstractNumId="6" w15:restartNumberingAfterBreak="0">
     <w:nsid w:val="2697169A"/>
     <w:multiLevelType w:val="multilevel"/>
     <w:tmpl w:val="798C7F94"/>
@@ -5001,7 +6108,7 @@
       </w:rPr>
     </w:lvl>
   </w:abstractNum>
-  <w:abstractNum w:abstractNumId="5" w15:restartNumberingAfterBreak="0">
+  <w:abstractNum w:abstractNumId="7" w15:restartNumberingAfterBreak="0">
     <w:nsid w:val="2EAE7A36"/>
     <w:multiLevelType w:val="multilevel"/>
     <w:tmpl w:val="9858D02C"/>
@@ -5142,7 +6249,7 @@
       </w:rPr>
     </w:lvl>
   </w:abstractNum>
-  <w:abstractNum w:abstractNumId="6" w15:restartNumberingAfterBreak="0">
+  <w:abstractNum w:abstractNumId="8" w15:restartNumberingAfterBreak="0">
     <w:nsid w:val="2FB203D5"/>
     <w:multiLevelType w:val="multilevel"/>
     <w:tmpl w:val="49D83C04"/>
@@ -5283,7 +6390,148 @@
       </w:rPr>
     </w:lvl>
   </w:abstractNum>
-  <w:abstractNum w:abstractNumId="7" w15:restartNumberingAfterBreak="0">
+  <w:abstractNum w:abstractNumId="9" w15:restartNumberingAfterBreak="0">
+    <w:nsid w:val="31FE29BF"/>
+    <w:multiLevelType w:val="multilevel"/>
+    <w:tmpl w:val="87C4DE16"/>
+    <w:lvl w:ilvl="0">
+      <w:start w:val="1"/>
+      <w:numFmt w:val="bullet"/>
+      <w:lvlText w:val=""/>
+      <w:lvlJc w:val="left"/>
+      <w:pPr>
+        <w:tabs>
+          <w:tab w:val="num" w:pos="720"/>
+        </w:tabs>
+        <w:ind w:left="720" w:hanging="360"/>
+      </w:pPr>
+      <w:rPr>
+        <w:rFonts w:ascii="Symbol" w:hAnsi="Symbol" w:hint="default"/>
+        <w:sz w:val="20"/>
+      </w:rPr>
+    </w:lvl>
+    <w:lvl w:ilvl="1" w:tentative="1">
+      <w:numFmt w:val="bullet"/>
+      <w:lvlText w:val="o"/>
+      <w:lvlJc w:val="left"/>
+      <w:pPr>
+        <w:tabs>
+          <w:tab w:val="num" w:pos="1440"/>
+        </w:tabs>
+        <w:ind w:left="1440" w:hanging="360"/>
+      </w:pPr>
+      <w:rPr>
+        <w:rFonts w:ascii="Courier New" w:hAnsi="Courier New" w:hint="default"/>
+        <w:sz w:val="20"/>
+      </w:rPr>
+    </w:lvl>
+    <w:lvl w:ilvl="2" w:tentative="1">
+      <w:numFmt w:val="bullet"/>
+      <w:lvlText w:val=""/>
+      <w:lvlJc w:val="left"/>
+      <w:pPr>
+        <w:tabs>
+          <w:tab w:val="num" w:pos="2160"/>
+        </w:tabs>
+        <w:ind w:left="2160" w:hanging="360"/>
+      </w:pPr>
+      <w:rPr>
+        <w:rFonts w:ascii="Wingdings" w:hAnsi="Wingdings" w:hint="default"/>
+        <w:sz w:val="20"/>
+      </w:rPr>
+    </w:lvl>
+    <w:lvl w:ilvl="3" w:tentative="1">
+      <w:numFmt w:val="bullet"/>
+      <w:lvlText w:val=""/>
+      <w:lvlJc w:val="left"/>
+      <w:pPr>
+        <w:tabs>
+          <w:tab w:val="num" w:pos="2880"/>
+        </w:tabs>
+        <w:ind w:left="2880" w:hanging="360"/>
+      </w:pPr>
+      <w:rPr>
+        <w:rFonts w:ascii="Wingdings" w:hAnsi="Wingdings" w:hint="default"/>
+        <w:sz w:val="20"/>
+      </w:rPr>
+    </w:lvl>
+    <w:lvl w:ilvl="4" w:tentative="1">
+      <w:numFmt w:val="bullet"/>
+      <w:lvlText w:val=""/>
+      <w:lvlJc w:val="left"/>
+      <w:pPr>
+        <w:tabs>
+          <w:tab w:val="num" w:pos="3600"/>
+        </w:tabs>
+        <w:ind w:left="3600" w:hanging="360"/>
+      </w:pPr>
+      <w:rPr>
+        <w:rFonts w:ascii="Wingdings" w:hAnsi="Wingdings" w:hint="default"/>
+        <w:sz w:val="20"/>
+      </w:rPr>
+    </w:lvl>
+    <w:lvl w:ilvl="5" w:tentative="1">
+      <w:numFmt w:val="bullet"/>
+      <w:lvlText w:val=""/>
+      <w:lvlJc w:val="left"/>
+      <w:pPr>
+        <w:tabs>
+          <w:tab w:val="num" w:pos="4320"/>
+        </w:tabs>
+        <w:ind w:left="4320" w:hanging="360"/>
+      </w:pPr>
+      <w:rPr>
+        <w:rFonts w:ascii="Wingdings" w:hAnsi="Wingdings" w:hint="default"/>
+        <w:sz w:val="20"/>
+      </w:rPr>
+    </w:lvl>
+    <w:lvl w:ilvl="6" w:tentative="1">
+      <w:numFmt w:val="bullet"/>
+      <w:lvlText w:val=""/>
+      <w:lvlJc w:val="left"/>
+      <w:pPr>
+        <w:tabs>
+          <w:tab w:val="num" w:pos="5040"/>
+        </w:tabs>
+        <w:ind w:left="5040" w:hanging="360"/>
+      </w:pPr>
+      <w:rPr>
+        <w:rFonts w:ascii="Wingdings" w:hAnsi="Wingdings" w:hint="default"/>
+        <w:sz w:val="20"/>
+      </w:rPr>
+    </w:lvl>
+    <w:lvl w:ilvl="7" w:tentative="1">
+      <w:numFmt w:val="bullet"/>
+      <w:lvlText w:val=""/>
+      <w:lvlJc w:val="left"/>
+      <w:pPr>
+        <w:tabs>
+          <w:tab w:val="num" w:pos="5760"/>
+        </w:tabs>
+        <w:ind w:left="5760" w:hanging="360"/>
+      </w:pPr>
+      <w:rPr>
+        <w:rFonts w:ascii="Wingdings" w:hAnsi="Wingdings" w:hint="default"/>
+        <w:sz w:val="20"/>
+      </w:rPr>
+    </w:lvl>
+    <w:lvl w:ilvl="8" w:tentative="1">
+      <w:numFmt w:val="bullet"/>
+      <w:lvlText w:val=""/>
+      <w:lvlJc w:val="left"/>
+      <w:pPr>
+        <w:tabs>
+          <w:tab w:val="num" w:pos="6480"/>
+        </w:tabs>
+        <w:ind w:left="6480" w:hanging="360"/>
+      </w:pPr>
+      <w:rPr>
+        <w:rFonts w:ascii="Wingdings" w:hAnsi="Wingdings" w:hint="default"/>
+        <w:sz w:val="20"/>
+      </w:rPr>
+    </w:lvl>
+  </w:abstractNum>
+  <w:abstractNum w:abstractNumId="10" w15:restartNumberingAfterBreak="0">
     <w:nsid w:val="37405E46"/>
     <w:multiLevelType w:val="multilevel"/>
     <w:tmpl w:val="F3023F20"/>
@@ -5424,7 +6672,7 @@
       </w:rPr>
     </w:lvl>
   </w:abstractNum>
-  <w:abstractNum w:abstractNumId="8" w15:restartNumberingAfterBreak="0">
+  <w:abstractNum w:abstractNumId="11" w15:restartNumberingAfterBreak="0">
     <w:nsid w:val="37766C36"/>
     <w:multiLevelType w:val="multilevel"/>
     <w:tmpl w:val="2E20F1EA"/>
@@ -5565,7 +6813,7 @@
       </w:rPr>
     </w:lvl>
   </w:abstractNum>
-  <w:abstractNum w:abstractNumId="9" w15:restartNumberingAfterBreak="0">
+  <w:abstractNum w:abstractNumId="12" w15:restartNumberingAfterBreak="0">
     <w:nsid w:val="4315500E"/>
     <w:multiLevelType w:val="hybridMultilevel"/>
     <w:tmpl w:val="55643D60"/>
@@ -5677,7 +6925,148 @@
       </w:rPr>
     </w:lvl>
   </w:abstractNum>
-  <w:abstractNum w:abstractNumId="10" w15:restartNumberingAfterBreak="0">
+  <w:abstractNum w:abstractNumId="13" w15:restartNumberingAfterBreak="0">
+    <w:nsid w:val="4C3F59A6"/>
+    <w:multiLevelType w:val="multilevel"/>
+    <w:tmpl w:val="F71C7220"/>
+    <w:lvl w:ilvl="0">
+      <w:start w:val="1"/>
+      <w:numFmt w:val="bullet"/>
+      <w:lvlText w:val=""/>
+      <w:lvlJc w:val="left"/>
+      <w:pPr>
+        <w:tabs>
+          <w:tab w:val="num" w:pos="720"/>
+        </w:tabs>
+        <w:ind w:left="720" w:hanging="360"/>
+      </w:pPr>
+      <w:rPr>
+        <w:rFonts w:ascii="Symbol" w:hAnsi="Symbol" w:hint="default"/>
+        <w:sz w:val="20"/>
+      </w:rPr>
+    </w:lvl>
+    <w:lvl w:ilvl="1" w:tentative="1">
+      <w:numFmt w:val="bullet"/>
+      <w:lvlText w:val="o"/>
+      <w:lvlJc w:val="left"/>
+      <w:pPr>
+        <w:tabs>
+          <w:tab w:val="num" w:pos="1440"/>
+        </w:tabs>
+        <w:ind w:left="1440" w:hanging="360"/>
+      </w:pPr>
+      <w:rPr>
+        <w:rFonts w:ascii="Courier New" w:hAnsi="Courier New" w:hint="default"/>
+        <w:sz w:val="20"/>
+      </w:rPr>
+    </w:lvl>
+    <w:lvl w:ilvl="2" w:tentative="1">
+      <w:numFmt w:val="bullet"/>
+      <w:lvlText w:val=""/>
+      <w:lvlJc w:val="left"/>
+      <w:pPr>
+        <w:tabs>
+          <w:tab w:val="num" w:pos="2160"/>
+        </w:tabs>
+        <w:ind w:left="2160" w:hanging="360"/>
+      </w:pPr>
+      <w:rPr>
+        <w:rFonts w:ascii="Wingdings" w:hAnsi="Wingdings" w:hint="default"/>
+        <w:sz w:val="20"/>
+      </w:rPr>
+    </w:lvl>
+    <w:lvl w:ilvl="3" w:tentative="1">
+      <w:numFmt w:val="bullet"/>
+      <w:lvlText w:val=""/>
+      <w:lvlJc w:val="left"/>
+      <w:pPr>
+        <w:tabs>
+          <w:tab w:val="num" w:pos="2880"/>
+        </w:tabs>
+        <w:ind w:left="2880" w:hanging="360"/>
+      </w:pPr>
+      <w:rPr>
+        <w:rFonts w:ascii="Wingdings" w:hAnsi="Wingdings" w:hint="default"/>
+        <w:sz w:val="20"/>
+      </w:rPr>
+    </w:lvl>
+    <w:lvl w:ilvl="4" w:tentative="1">
+      <w:numFmt w:val="bullet"/>
+      <w:lvlText w:val=""/>
+      <w:lvlJc w:val="left"/>
+      <w:pPr>
+        <w:tabs>
+          <w:tab w:val="num" w:pos="3600"/>
+        </w:tabs>
+        <w:ind w:left="3600" w:hanging="360"/>
+      </w:pPr>
+      <w:rPr>
+        <w:rFonts w:ascii="Wingdings" w:hAnsi="Wingdings" w:hint="default"/>
+        <w:sz w:val="20"/>
+      </w:rPr>
+    </w:lvl>
+    <w:lvl w:ilvl="5" w:tentative="1">
+      <w:numFmt w:val="bullet"/>
+      <w:lvlText w:val=""/>
+      <w:lvlJc w:val="left"/>
+      <w:pPr>
+        <w:tabs>
+          <w:tab w:val="num" w:pos="4320"/>
+        </w:tabs>
+        <w:ind w:left="4320" w:hanging="360"/>
+      </w:pPr>
+      <w:rPr>
+        <w:rFonts w:ascii="Wingdings" w:hAnsi="Wingdings" w:hint="default"/>
+        <w:sz w:val="20"/>
+      </w:rPr>
+    </w:lvl>
+    <w:lvl w:ilvl="6" w:tentative="1">
+      <w:numFmt w:val="bullet"/>
+      <w:lvlText w:val=""/>
+      <w:lvlJc w:val="left"/>
+      <w:pPr>
+        <w:tabs>
+          <w:tab w:val="num" w:pos="5040"/>
+        </w:tabs>
+        <w:ind w:left="5040" w:hanging="360"/>
+      </w:pPr>
+      <w:rPr>
+        <w:rFonts w:ascii="Wingdings" w:hAnsi="Wingdings" w:hint="default"/>
+        <w:sz w:val="20"/>
+      </w:rPr>
+    </w:lvl>
+    <w:lvl w:ilvl="7" w:tentative="1">
+      <w:numFmt w:val="bullet"/>
+      <w:lvlText w:val=""/>
+      <w:lvlJc w:val="left"/>
+      <w:pPr>
+        <w:tabs>
+          <w:tab w:val="num" w:pos="5760"/>
+        </w:tabs>
+        <w:ind w:left="5760" w:hanging="360"/>
+      </w:pPr>
+      <w:rPr>
+        <w:rFonts w:ascii="Wingdings" w:hAnsi="Wingdings" w:hint="default"/>
+        <w:sz w:val="20"/>
+      </w:rPr>
+    </w:lvl>
+    <w:lvl w:ilvl="8" w:tentative="1">
+      <w:numFmt w:val="bullet"/>
+      <w:lvlText w:val=""/>
+      <w:lvlJc w:val="left"/>
+      <w:pPr>
+        <w:tabs>
+          <w:tab w:val="num" w:pos="6480"/>
+        </w:tabs>
+        <w:ind w:left="6480" w:hanging="360"/>
+      </w:pPr>
+      <w:rPr>
+        <w:rFonts w:ascii="Wingdings" w:hAnsi="Wingdings" w:hint="default"/>
+        <w:sz w:val="20"/>
+      </w:rPr>
+    </w:lvl>
+  </w:abstractNum>
+  <w:abstractNum w:abstractNumId="14" w15:restartNumberingAfterBreak="0">
     <w:nsid w:val="5006401C"/>
     <w:multiLevelType w:val="multilevel"/>
     <w:tmpl w:val="5308B03C"/>
@@ -5818,7 +7207,7 @@
       </w:rPr>
     </w:lvl>
   </w:abstractNum>
-  <w:abstractNum w:abstractNumId="11" w15:restartNumberingAfterBreak="0">
+  <w:abstractNum w:abstractNumId="15" w15:restartNumberingAfterBreak="0">
     <w:nsid w:val="53C0270D"/>
     <w:multiLevelType w:val="multilevel"/>
     <w:tmpl w:val="CB5C3B90"/>
@@ -5959,7 +7348,7 @@
       </w:rPr>
     </w:lvl>
   </w:abstractNum>
-  <w:abstractNum w:abstractNumId="12" w15:restartNumberingAfterBreak="0">
+  <w:abstractNum w:abstractNumId="16" w15:restartNumberingAfterBreak="0">
     <w:nsid w:val="58575794"/>
     <w:multiLevelType w:val="multilevel"/>
     <w:tmpl w:val="360CEA88"/>
@@ -6064,7 +7453,148 @@
       </w:pPr>
     </w:lvl>
   </w:abstractNum>
-  <w:abstractNum w:abstractNumId="13" w15:restartNumberingAfterBreak="0">
+  <w:abstractNum w:abstractNumId="17" w15:restartNumberingAfterBreak="0">
+    <w:nsid w:val="5A1D52F9"/>
+    <w:multiLevelType w:val="multilevel"/>
+    <w:tmpl w:val="C1346798"/>
+    <w:lvl w:ilvl="0">
+      <w:start w:val="1"/>
+      <w:numFmt w:val="bullet"/>
+      <w:lvlText w:val=""/>
+      <w:lvlJc w:val="left"/>
+      <w:pPr>
+        <w:tabs>
+          <w:tab w:val="num" w:pos="720"/>
+        </w:tabs>
+        <w:ind w:left="720" w:hanging="360"/>
+      </w:pPr>
+      <w:rPr>
+        <w:rFonts w:ascii="Symbol" w:hAnsi="Symbol" w:hint="default"/>
+        <w:sz w:val="20"/>
+      </w:rPr>
+    </w:lvl>
+    <w:lvl w:ilvl="1" w:tentative="1">
+      <w:numFmt w:val="bullet"/>
+      <w:lvlText w:val="o"/>
+      <w:lvlJc w:val="left"/>
+      <w:pPr>
+        <w:tabs>
+          <w:tab w:val="num" w:pos="1440"/>
+        </w:tabs>
+        <w:ind w:left="1440" w:hanging="360"/>
+      </w:pPr>
+      <w:rPr>
+        <w:rFonts w:ascii="Courier New" w:hAnsi="Courier New" w:hint="default"/>
+        <w:sz w:val="20"/>
+      </w:rPr>
+    </w:lvl>
+    <w:lvl w:ilvl="2" w:tentative="1">
+      <w:numFmt w:val="bullet"/>
+      <w:lvlText w:val=""/>
+      <w:lvlJc w:val="left"/>
+      <w:pPr>
+        <w:tabs>
+          <w:tab w:val="num" w:pos="2160"/>
+        </w:tabs>
+        <w:ind w:left="2160" w:hanging="360"/>
+      </w:pPr>
+      <w:rPr>
+        <w:rFonts w:ascii="Wingdings" w:hAnsi="Wingdings" w:hint="default"/>
+        <w:sz w:val="20"/>
+      </w:rPr>
+    </w:lvl>
+    <w:lvl w:ilvl="3" w:tentative="1">
+      <w:numFmt w:val="bullet"/>
+      <w:lvlText w:val=""/>
+      <w:lvlJc w:val="left"/>
+      <w:pPr>
+        <w:tabs>
+          <w:tab w:val="num" w:pos="2880"/>
+        </w:tabs>
+        <w:ind w:left="2880" w:hanging="360"/>
+      </w:pPr>
+      <w:rPr>
+        <w:rFonts w:ascii="Wingdings" w:hAnsi="Wingdings" w:hint="default"/>
+        <w:sz w:val="20"/>
+      </w:rPr>
+    </w:lvl>
+    <w:lvl w:ilvl="4" w:tentative="1">
+      <w:numFmt w:val="bullet"/>
+      <w:lvlText w:val=""/>
+      <w:lvlJc w:val="left"/>
+      <w:pPr>
+        <w:tabs>
+          <w:tab w:val="num" w:pos="3600"/>
+        </w:tabs>
+        <w:ind w:left="3600" w:hanging="360"/>
+      </w:pPr>
+      <w:rPr>
+        <w:rFonts w:ascii="Wingdings" w:hAnsi="Wingdings" w:hint="default"/>
+        <w:sz w:val="20"/>
+      </w:rPr>
+    </w:lvl>
+    <w:lvl w:ilvl="5" w:tentative="1">
+      <w:numFmt w:val="bullet"/>
+      <w:lvlText w:val=""/>
+      <w:lvlJc w:val="left"/>
+      <w:pPr>
+        <w:tabs>
+          <w:tab w:val="num" w:pos="4320"/>
+        </w:tabs>
+        <w:ind w:left="4320" w:hanging="360"/>
+      </w:pPr>
+      <w:rPr>
+        <w:rFonts w:ascii="Wingdings" w:hAnsi="Wingdings" w:hint="default"/>
+        <w:sz w:val="20"/>
+      </w:rPr>
+    </w:lvl>
+    <w:lvl w:ilvl="6" w:tentative="1">
+      <w:numFmt w:val="bullet"/>
+      <w:lvlText w:val=""/>
+      <w:lvlJc w:val="left"/>
+      <w:pPr>
+        <w:tabs>
+          <w:tab w:val="num" w:pos="5040"/>
+        </w:tabs>
+        <w:ind w:left="5040" w:hanging="360"/>
+      </w:pPr>
+      <w:rPr>
+        <w:rFonts w:ascii="Wingdings" w:hAnsi="Wingdings" w:hint="default"/>
+        <w:sz w:val="20"/>
+      </w:rPr>
+    </w:lvl>
+    <w:lvl w:ilvl="7" w:tentative="1">
+      <w:numFmt w:val="bullet"/>
+      <w:lvlText w:val=""/>
+      <w:lvlJc w:val="left"/>
+      <w:pPr>
+        <w:tabs>
+          <w:tab w:val="num" w:pos="5760"/>
+        </w:tabs>
+        <w:ind w:left="5760" w:hanging="360"/>
+      </w:pPr>
+      <w:rPr>
+        <w:rFonts w:ascii="Wingdings" w:hAnsi="Wingdings" w:hint="default"/>
+        <w:sz w:val="20"/>
+      </w:rPr>
+    </w:lvl>
+    <w:lvl w:ilvl="8" w:tentative="1">
+      <w:numFmt w:val="bullet"/>
+      <w:lvlText w:val=""/>
+      <w:lvlJc w:val="left"/>
+      <w:pPr>
+        <w:tabs>
+          <w:tab w:val="num" w:pos="6480"/>
+        </w:tabs>
+        <w:ind w:left="6480" w:hanging="360"/>
+      </w:pPr>
+      <w:rPr>
+        <w:rFonts w:ascii="Wingdings" w:hAnsi="Wingdings" w:hint="default"/>
+        <w:sz w:val="20"/>
+      </w:rPr>
+    </w:lvl>
+  </w:abstractNum>
+  <w:abstractNum w:abstractNumId="18" w15:restartNumberingAfterBreak="0">
     <w:nsid w:val="64554A3B"/>
     <w:multiLevelType w:val="multilevel"/>
     <w:tmpl w:val="EE7A7AF0"/>
@@ -6206,46 +7736,61 @@
     </w:lvl>
   </w:abstractNum>
   <w:num w:numId="1" w16cid:durableId="1503819065">
+    <w:abstractNumId w:val="16"/>
+  </w:num>
+  <w:num w:numId="2" w16cid:durableId="1782332989">
+    <w:abstractNumId w:val="14"/>
+  </w:num>
+  <w:num w:numId="3" w16cid:durableId="1919053977">
+    <w:abstractNumId w:val="15"/>
+  </w:num>
+  <w:num w:numId="4" w16cid:durableId="1999655247">
+    <w:abstractNumId w:val="18"/>
+  </w:num>
+  <w:num w:numId="5" w16cid:durableId="55396813">
+    <w:abstractNumId w:val="1"/>
+  </w:num>
+  <w:num w:numId="6" w16cid:durableId="1874343171">
+    <w:abstractNumId w:val="4"/>
+  </w:num>
+  <w:num w:numId="7" w16cid:durableId="1905411550">
+    <w:abstractNumId w:val="11"/>
+  </w:num>
+  <w:num w:numId="8" w16cid:durableId="519200190">
+    <w:abstractNumId w:val="6"/>
+  </w:num>
+  <w:num w:numId="9" w16cid:durableId="340398922">
+    <w:abstractNumId w:val="8"/>
+  </w:num>
+  <w:num w:numId="10" w16cid:durableId="1125081338">
+    <w:abstractNumId w:val="7"/>
+  </w:num>
+  <w:num w:numId="11" w16cid:durableId="305667566">
+    <w:abstractNumId w:val="3"/>
+  </w:num>
+  <w:num w:numId="12" w16cid:durableId="2143425099">
+    <w:abstractNumId w:val="2"/>
+  </w:num>
+  <w:num w:numId="13" w16cid:durableId="1465848597">
     <w:abstractNumId w:val="12"/>
   </w:num>
-  <w:num w:numId="2" w16cid:durableId="1782332989">
+  <w:num w:numId="14" w16cid:durableId="360670403">
     <w:abstractNumId w:val="10"/>
   </w:num>
-  <w:num w:numId="3" w16cid:durableId="1919053977">
-    <w:abstractNumId w:val="11"/>
-  </w:num>
-  <w:num w:numId="4" w16cid:durableId="1999655247">
+  <w:num w:numId="15" w16cid:durableId="284699471">
     <w:abstractNumId w:val="13"/>
   </w:num>
-  <w:num w:numId="5" w16cid:durableId="55396813">
+  <w:num w:numId="16" w16cid:durableId="1766992668">
+    <w:abstractNumId w:val="17"/>
+  </w:num>
+  <w:num w:numId="17" w16cid:durableId="57871093">
     <w:abstractNumId w:val="0"/>
   </w:num>
-  <w:num w:numId="6" w16cid:durableId="1874343171">
-    <w:abstractNumId w:val="3"/>
-  </w:num>
-  <w:num w:numId="7" w16cid:durableId="1905411550">
-    <w:abstractNumId w:val="8"/>
-  </w:num>
-  <w:num w:numId="8" w16cid:durableId="519200190">
-    <w:abstractNumId w:val="4"/>
-  </w:num>
-  <w:num w:numId="9" w16cid:durableId="340398922">
-    <w:abstractNumId w:val="6"/>
-  </w:num>
-  <w:num w:numId="10" w16cid:durableId="1125081338">
-    <w:abstractNumId w:val="5"/>
-  </w:num>
-  <w:num w:numId="11" w16cid:durableId="305667566">
-    <w:abstractNumId w:val="2"/>
-  </w:num>
-  <w:num w:numId="12" w16cid:durableId="2143425099">
-    <w:abstractNumId w:val="1"/>
-  </w:num>
-  <w:num w:numId="13" w16cid:durableId="1465848597">
+  <w:num w:numId="18" w16cid:durableId="830406820">
     <w:abstractNumId w:val="9"/>
   </w:num>
-  <w:num w:numId="14" w16cid:durableId="360670403">
-    <w:abstractNumId w:val="7"/>
+  <w:num w:numId="19" w16cid:durableId="1285305354">
+    <w:abstractNumId w:val="5"/>
   </w:num>
 </w:numbering>
 </file>

</xml_diff>